<commit_message>
Use Supabase as the hosted PostgreSQL database
- DATABASE_URL support with SSL (Supabase session pooler); local PostgreSQL still works
- Row Level Security on all tables, security_invoker views, fixed function search_path
- README and report updated

Co-Authored-By: Claude Opus 5.5 <noreply@anthropic.com>
</commit_message>
<xml_diff>
--- a/Movie_Ticket_Booking_System_Report.docx
+++ b/Movie_Ticket_Booking_System_Report.docx
@@ -163,14 +163,13 @@
           <w:sz w:val="32"/>
           <w:szCs w:val="32"/>
         </w:rPr>
-        <w:lastRenderedPageBreak/>
         <w:t>Table of Contents</w:t>
       </w:r>
     </w:p>
     <w:sdt>
       <w:sdtPr>
         <w:alias w:val="Table of Contents"/>
-        <w:id w:val="-194156278"/>
+        <w:id w:val="-11838818"/>
       </w:sdtPr>
       <w:sdtEndPr/>
       <w:sdtContent>
@@ -198,7 +197,7 @@
           <w:r>
             <w:fldChar w:fldCharType="separate"/>
           </w:r>
-          <w:hyperlink w:anchor="_Toc241624084" w:history="1">
+          <w:hyperlink w:anchor="_Toc242128220" w:history="1">
             <w:r>
               <w:rPr>
                 <w:rStyle w:val="Hyperlink"/>
@@ -222,7 +221,7 @@
               <w:rPr>
                 <w:noProof/>
               </w:rPr>
-              <w:instrText xml:space="preserve"> PAGEREF _Toc241624084 \h </w:instrText>
+              <w:instrText xml:space="preserve"> PAGEREF _Toc242128220 \h </w:instrText>
             </w:r>
             <w:r>
               <w:rPr>
@@ -264,7 +263,7 @@
               <w14:ligatures w14:val="standardContextual"/>
             </w:rPr>
           </w:pPr>
-          <w:hyperlink w:anchor="_Toc241624085" w:history="1">
+          <w:hyperlink w:anchor="_Toc242128221" w:history="1">
             <w:r>
               <w:rPr>
                 <w:rStyle w:val="Hyperlink"/>
@@ -288,7 +287,7 @@
               <w:rPr>
                 <w:noProof/>
               </w:rPr>
-              <w:instrText xml:space="preserve"> PAGEREF _Toc241624085 \h </w:instrText>
+              <w:instrText xml:space="preserve"> PAGEREF _Toc242128221 \h </w:instrText>
             </w:r>
             <w:r>
               <w:rPr>
@@ -330,7 +329,7 @@
               <w14:ligatures w14:val="standardContextual"/>
             </w:rPr>
           </w:pPr>
-          <w:hyperlink w:anchor="_Toc241624086" w:history="1">
+          <w:hyperlink w:anchor="_Toc242128222" w:history="1">
             <w:r>
               <w:rPr>
                 <w:rStyle w:val="Hyperlink"/>
@@ -354,7 +353,7 @@
               <w:rPr>
                 <w:noProof/>
               </w:rPr>
-              <w:instrText xml:space="preserve"> PAGEREF _Toc241624086 \h </w:instrText>
+              <w:instrText xml:space="preserve"> PAGEREF _Toc242128222 \h </w:instrText>
             </w:r>
             <w:r>
               <w:rPr>
@@ -396,7 +395,7 @@
               <w14:ligatures w14:val="standardContextual"/>
             </w:rPr>
           </w:pPr>
-          <w:hyperlink w:anchor="_Toc241624087" w:history="1">
+          <w:hyperlink w:anchor="_Toc242128223" w:history="1">
             <w:r>
               <w:rPr>
                 <w:rStyle w:val="Hyperlink"/>
@@ -420,7 +419,7 @@
               <w:rPr>
                 <w:noProof/>
               </w:rPr>
-              <w:instrText xml:space="preserve"> PAGEREF _Toc241624087 \h </w:instrText>
+              <w:instrText xml:space="preserve"> PAGEREF _Toc242128223 \h </w:instrText>
             </w:r>
             <w:r>
               <w:rPr>
@@ -462,7 +461,7 @@
               <w14:ligatures w14:val="standardContextual"/>
             </w:rPr>
           </w:pPr>
-          <w:hyperlink w:anchor="_Toc241624088" w:history="1">
+          <w:hyperlink w:anchor="_Toc242128224" w:history="1">
             <w:r>
               <w:rPr>
                 <w:rStyle w:val="Hyperlink"/>
@@ -486,7 +485,7 @@
               <w:rPr>
                 <w:noProof/>
               </w:rPr>
-              <w:instrText xml:space="preserve"> PAGEREF _Toc241624088 \h </w:instrText>
+              <w:instrText xml:space="preserve"> PAGEREF _Toc242128224 \h </w:instrText>
             </w:r>
             <w:r>
               <w:rPr>
@@ -528,7 +527,7 @@
               <w14:ligatures w14:val="standardContextual"/>
             </w:rPr>
           </w:pPr>
-          <w:hyperlink w:anchor="_Toc241624089" w:history="1">
+          <w:hyperlink w:anchor="_Toc242128225" w:history="1">
             <w:r>
               <w:rPr>
                 <w:rStyle w:val="Hyperlink"/>
@@ -552,7 +551,7 @@
               <w:rPr>
                 <w:noProof/>
               </w:rPr>
-              <w:instrText xml:space="preserve"> PAGEREF _Toc241624089 \h </w:instrText>
+              <w:instrText xml:space="preserve"> PAGEREF _Toc242128225 \h </w:instrText>
             </w:r>
             <w:r>
               <w:rPr>
@@ -594,7 +593,7 @@
               <w14:ligatures w14:val="standardContextual"/>
             </w:rPr>
           </w:pPr>
-          <w:hyperlink w:anchor="_Toc241624090" w:history="1">
+          <w:hyperlink w:anchor="_Toc242128226" w:history="1">
             <w:r>
               <w:rPr>
                 <w:rStyle w:val="Hyperlink"/>
@@ -618,7 +617,7 @@
               <w:rPr>
                 <w:noProof/>
               </w:rPr>
-              <w:instrText xml:space="preserve"> PAGEREF _Toc241624090 \h </w:instrText>
+              <w:instrText xml:space="preserve"> PAGEREF _Toc242128226 \h </w:instrText>
             </w:r>
             <w:r>
               <w:rPr>
@@ -660,7 +659,7 @@
               <w14:ligatures w14:val="standardContextual"/>
             </w:rPr>
           </w:pPr>
-          <w:hyperlink w:anchor="_Toc241624091" w:history="1">
+          <w:hyperlink w:anchor="_Toc242128227" w:history="1">
             <w:r>
               <w:rPr>
                 <w:rStyle w:val="Hyperlink"/>
@@ -684,7 +683,7 @@
               <w:rPr>
                 <w:noProof/>
               </w:rPr>
-              <w:instrText xml:space="preserve"> PAGEREF _Toc241624091 \h </w:instrText>
+              <w:instrText xml:space="preserve"> PAGEREF _Toc242128227 \h </w:instrText>
             </w:r>
             <w:r>
               <w:rPr>
@@ -726,7 +725,7 @@
               <w14:ligatures w14:val="standardContextual"/>
             </w:rPr>
           </w:pPr>
-          <w:hyperlink w:anchor="_Toc241624092" w:history="1">
+          <w:hyperlink w:anchor="_Toc242128228" w:history="1">
             <w:r>
               <w:rPr>
                 <w:rStyle w:val="Hyperlink"/>
@@ -750,7 +749,7 @@
               <w:rPr>
                 <w:noProof/>
               </w:rPr>
-              <w:instrText xml:space="preserve"> PAGEREF _Toc241624092 \h </w:instrText>
+              <w:instrText xml:space="preserve"> PAGEREF _Toc242128228 \h </w:instrText>
             </w:r>
             <w:r>
               <w:rPr>
@@ -792,7 +791,7 @@
               <w14:ligatures w14:val="standardContextual"/>
             </w:rPr>
           </w:pPr>
-          <w:hyperlink w:anchor="_Toc241624093" w:history="1">
+          <w:hyperlink w:anchor="_Toc242128229" w:history="1">
             <w:r>
               <w:rPr>
                 <w:rStyle w:val="Hyperlink"/>
@@ -816,7 +815,7 @@
               <w:rPr>
                 <w:noProof/>
               </w:rPr>
-              <w:instrText xml:space="preserve"> PAGEREF _Toc241624093 \h </w:instrText>
+              <w:instrText xml:space="preserve"> PAGEREF _Toc242128229 \h </w:instrText>
             </w:r>
             <w:r>
               <w:rPr>
@@ -858,7 +857,7 @@
               <w14:ligatures w14:val="standardContextual"/>
             </w:rPr>
           </w:pPr>
-          <w:hyperlink w:anchor="_Toc241624094" w:history="1">
+          <w:hyperlink w:anchor="_Toc242128230" w:history="1">
             <w:r>
               <w:rPr>
                 <w:rStyle w:val="Hyperlink"/>
@@ -882,7 +881,7 @@
               <w:rPr>
                 <w:noProof/>
               </w:rPr>
-              <w:instrText xml:space="preserve"> PAGEREF _Toc241624094 \h </w:instrText>
+              <w:instrText xml:space="preserve"> PAGEREF _Toc242128230 \h </w:instrText>
             </w:r>
             <w:r>
               <w:rPr>
@@ -924,7 +923,7 @@
               <w14:ligatures w14:val="standardContextual"/>
             </w:rPr>
           </w:pPr>
-          <w:hyperlink w:anchor="_Toc241624095" w:history="1">
+          <w:hyperlink w:anchor="_Toc242128231" w:history="1">
             <w:r>
               <w:rPr>
                 <w:rStyle w:val="Hyperlink"/>
@@ -948,7 +947,7 @@
               <w:rPr>
                 <w:noProof/>
               </w:rPr>
-              <w:instrText xml:space="preserve"> PAGEREF _Toc241624095 \h </w:instrText>
+              <w:instrText xml:space="preserve"> PAGEREF _Toc242128231 \h </w:instrText>
             </w:r>
             <w:r>
               <w:rPr>
@@ -990,7 +989,7 @@
               <w14:ligatures w14:val="standardContextual"/>
             </w:rPr>
           </w:pPr>
-          <w:hyperlink w:anchor="_Toc241624096" w:history="1">
+          <w:hyperlink w:anchor="_Toc242128232" w:history="1">
             <w:r>
               <w:rPr>
                 <w:rStyle w:val="Hyperlink"/>
@@ -1014,7 +1013,7 @@
               <w:rPr>
                 <w:noProof/>
               </w:rPr>
-              <w:instrText xml:space="preserve"> PAGEREF _Toc241624096 \h </w:instrText>
+              <w:instrText xml:space="preserve"> PAGEREF _Toc242128232 \h </w:instrText>
             </w:r>
             <w:r>
               <w:rPr>
@@ -1056,7 +1055,7 @@
               <w14:ligatures w14:val="standardContextual"/>
             </w:rPr>
           </w:pPr>
-          <w:hyperlink w:anchor="_Toc241624097" w:history="1">
+          <w:hyperlink w:anchor="_Toc242128233" w:history="1">
             <w:r>
               <w:rPr>
                 <w:rStyle w:val="Hyperlink"/>
@@ -1080,7 +1079,7 @@
               <w:rPr>
                 <w:noProof/>
               </w:rPr>
-              <w:instrText xml:space="preserve"> PAGEREF _Toc241624097 \h </w:instrText>
+              <w:instrText xml:space="preserve"> PAGEREF _Toc242128233 \h </w:instrText>
             </w:r>
             <w:r>
               <w:rPr>
@@ -1122,7 +1121,7 @@
               <w14:ligatures w14:val="standardContextual"/>
             </w:rPr>
           </w:pPr>
-          <w:hyperlink w:anchor="_Toc241624098" w:history="1">
+          <w:hyperlink w:anchor="_Toc242128234" w:history="1">
             <w:r>
               <w:rPr>
                 <w:rStyle w:val="Hyperlink"/>
@@ -1146,7 +1145,7 @@
               <w:rPr>
                 <w:noProof/>
               </w:rPr>
-              <w:instrText xml:space="preserve"> PAGEREF _Toc241624098 \h </w:instrText>
+              <w:instrText xml:space="preserve"> PAGEREF _Toc242128234 \h </w:instrText>
             </w:r>
             <w:r>
               <w:rPr>
@@ -1188,7 +1187,7 @@
               <w14:ligatures w14:val="standardContextual"/>
             </w:rPr>
           </w:pPr>
-          <w:hyperlink w:anchor="_Toc241624099" w:history="1">
+          <w:hyperlink w:anchor="_Toc242128235" w:history="1">
             <w:r>
               <w:rPr>
                 <w:rStyle w:val="Hyperlink"/>
@@ -1212,7 +1211,7 @@
               <w:rPr>
                 <w:noProof/>
               </w:rPr>
-              <w:instrText xml:space="preserve"> PAGEREF _Toc241624099 \h </w:instrText>
+              <w:instrText xml:space="preserve"> PAGEREF _Toc242128235 \h </w:instrText>
             </w:r>
             <w:r>
               <w:rPr>
@@ -1254,7 +1253,7 @@
               <w14:ligatures w14:val="standardContextual"/>
             </w:rPr>
           </w:pPr>
-          <w:hyperlink w:anchor="_Toc241624100" w:history="1">
+          <w:hyperlink w:anchor="_Toc242128236" w:history="1">
             <w:r>
               <w:rPr>
                 <w:rStyle w:val="Hyperlink"/>
@@ -1278,7 +1277,7 @@
               <w:rPr>
                 <w:noProof/>
               </w:rPr>
-              <w:instrText xml:space="preserve"> PAGEREF _Toc241624100 \h </w:instrText>
+              <w:instrText xml:space="preserve"> PAGEREF _Toc242128236 \h </w:instrText>
             </w:r>
             <w:r>
               <w:rPr>
@@ -1320,7 +1319,7 @@
               <w14:ligatures w14:val="standardContextual"/>
             </w:rPr>
           </w:pPr>
-          <w:hyperlink w:anchor="_Toc241624101" w:history="1">
+          <w:hyperlink w:anchor="_Toc242128237" w:history="1">
             <w:r>
               <w:rPr>
                 <w:rStyle w:val="Hyperlink"/>
@@ -1344,7 +1343,7 @@
               <w:rPr>
                 <w:noProof/>
               </w:rPr>
-              <w:instrText xml:space="preserve"> PAGEREF _Toc241624101 \h </w:instrText>
+              <w:instrText xml:space="preserve"> PAGEREF _Toc242128237 \h </w:instrText>
             </w:r>
             <w:r>
               <w:rPr>
@@ -1386,7 +1385,7 @@
               <w14:ligatures w14:val="standardContextual"/>
             </w:rPr>
           </w:pPr>
-          <w:hyperlink w:anchor="_Toc241624102" w:history="1">
+          <w:hyperlink w:anchor="_Toc242128238" w:history="1">
             <w:r>
               <w:rPr>
                 <w:rStyle w:val="Hyperlink"/>
@@ -1410,7 +1409,7 @@
               <w:rPr>
                 <w:noProof/>
               </w:rPr>
-              <w:instrText xml:space="preserve"> PAGEREF _Toc241624102 \h </w:instrText>
+              <w:instrText xml:space="preserve"> PAGEREF _Toc242128238 \h </w:instrText>
             </w:r>
             <w:r>
               <w:rPr>
@@ -1452,7 +1451,7 @@
               <w14:ligatures w14:val="standardContextual"/>
             </w:rPr>
           </w:pPr>
-          <w:hyperlink w:anchor="_Toc241624103" w:history="1">
+          <w:hyperlink w:anchor="_Toc242128239" w:history="1">
             <w:r>
               <w:rPr>
                 <w:rStyle w:val="Hyperlink"/>
@@ -1476,7 +1475,7 @@
               <w:rPr>
                 <w:noProof/>
               </w:rPr>
-              <w:instrText xml:space="preserve"> PAGEREF _Toc241624103 \h </w:instrText>
+              <w:instrText xml:space="preserve"> PAGEREF _Toc242128239 \h </w:instrText>
             </w:r>
             <w:r>
               <w:rPr>
@@ -1518,7 +1517,7 @@
               <w14:ligatures w14:val="standardContextual"/>
             </w:rPr>
           </w:pPr>
-          <w:hyperlink w:anchor="_Toc241624104" w:history="1">
+          <w:hyperlink w:anchor="_Toc242128240" w:history="1">
             <w:r>
               <w:rPr>
                 <w:rStyle w:val="Hyperlink"/>
@@ -1542,7 +1541,7 @@
               <w:rPr>
                 <w:noProof/>
               </w:rPr>
-              <w:instrText xml:space="preserve"> PAGEREF _Toc241624104 \h </w:instrText>
+              <w:instrText xml:space="preserve"> PAGEREF _Toc242128240 \h </w:instrText>
             </w:r>
             <w:r>
               <w:rPr>
@@ -1584,7 +1583,7 @@
               <w14:ligatures w14:val="standardContextual"/>
             </w:rPr>
           </w:pPr>
-          <w:hyperlink w:anchor="_Toc241624105" w:history="1">
+          <w:hyperlink w:anchor="_Toc242128241" w:history="1">
             <w:r>
               <w:rPr>
                 <w:rStyle w:val="Hyperlink"/>
@@ -1608,7 +1607,7 @@
               <w:rPr>
                 <w:noProof/>
               </w:rPr>
-              <w:instrText xml:space="preserve"> PAGEREF _Toc241624105 \h </w:instrText>
+              <w:instrText xml:space="preserve"> PAGEREF _Toc242128241 \h </w:instrText>
             </w:r>
             <w:r>
               <w:rPr>
@@ -1650,7 +1649,7 @@
               <w14:ligatures w14:val="standardContextual"/>
             </w:rPr>
           </w:pPr>
-          <w:hyperlink w:anchor="_Toc241624106" w:history="1">
+          <w:hyperlink w:anchor="_Toc242128242" w:history="1">
             <w:r>
               <w:rPr>
                 <w:rStyle w:val="Hyperlink"/>
@@ -1674,7 +1673,7 @@
               <w:rPr>
                 <w:noProof/>
               </w:rPr>
-              <w:instrText xml:space="preserve"> PAGEREF _Toc241624106 \h </w:instrText>
+              <w:instrText xml:space="preserve"> PAGEREF _Toc242128242 \h </w:instrText>
             </w:r>
             <w:r>
               <w:rPr>
@@ -1716,7 +1715,7 @@
               <w14:ligatures w14:val="standardContextual"/>
             </w:rPr>
           </w:pPr>
-          <w:hyperlink w:anchor="_Toc241624107" w:history="1">
+          <w:hyperlink w:anchor="_Toc242128243" w:history="1">
             <w:r>
               <w:rPr>
                 <w:rStyle w:val="Hyperlink"/>
@@ -1740,7 +1739,7 @@
               <w:rPr>
                 <w:noProof/>
               </w:rPr>
-              <w:instrText xml:space="preserve"> PAGEREF _Toc241624107 \h </w:instrText>
+              <w:instrText xml:space="preserve"> PAGEREF _Toc242128243 \h </w:instrText>
             </w:r>
             <w:r>
               <w:rPr>
@@ -1782,7 +1781,7 @@
               <w14:ligatures w14:val="standardContextual"/>
             </w:rPr>
           </w:pPr>
-          <w:hyperlink w:anchor="_Toc241624108" w:history="1">
+          <w:hyperlink w:anchor="_Toc242128244" w:history="1">
             <w:r>
               <w:rPr>
                 <w:rStyle w:val="Hyperlink"/>
@@ -1806,7 +1805,7 @@
               <w:rPr>
                 <w:noProof/>
               </w:rPr>
-              <w:instrText xml:space="preserve"> PAGEREF _Toc241624108 \h </w:instrText>
+              <w:instrText xml:space="preserve"> PAGEREF _Toc242128244 \h </w:instrText>
             </w:r>
             <w:r>
               <w:rPr>
@@ -1848,7 +1847,7 @@
               <w14:ligatures w14:val="standardContextual"/>
             </w:rPr>
           </w:pPr>
-          <w:hyperlink w:anchor="_Toc241624109" w:history="1">
+          <w:hyperlink w:anchor="_Toc242128245" w:history="1">
             <w:r>
               <w:rPr>
                 <w:rStyle w:val="Hyperlink"/>
@@ -1872,7 +1871,7 @@
               <w:rPr>
                 <w:noProof/>
               </w:rPr>
-              <w:instrText xml:space="preserve"> PAGEREF _Toc241624109 \h </w:instrText>
+              <w:instrText xml:space="preserve"> PAGEREF _Toc242128245 \h </w:instrText>
             </w:r>
             <w:r>
               <w:rPr>
@@ -1914,7 +1913,7 @@
               <w14:ligatures w14:val="standardContextual"/>
             </w:rPr>
           </w:pPr>
-          <w:hyperlink w:anchor="_Toc241624110" w:history="1">
+          <w:hyperlink w:anchor="_Toc242128246" w:history="1">
             <w:r>
               <w:rPr>
                 <w:rStyle w:val="Hyperlink"/>
@@ -1938,7 +1937,7 @@
               <w:rPr>
                 <w:noProof/>
               </w:rPr>
-              <w:instrText xml:space="preserve"> PAGEREF _Toc241624110 \h </w:instrText>
+              <w:instrText xml:space="preserve"> PAGEREF _Toc242128246 \h </w:instrText>
             </w:r>
             <w:r>
               <w:rPr>
@@ -1980,7 +1979,7 @@
               <w14:ligatures w14:val="standardContextual"/>
             </w:rPr>
           </w:pPr>
-          <w:hyperlink w:anchor="_Toc241624111" w:history="1">
+          <w:hyperlink w:anchor="_Toc242128247" w:history="1">
             <w:r>
               <w:rPr>
                 <w:rStyle w:val="Hyperlink"/>
@@ -2004,7 +2003,7 @@
               <w:rPr>
                 <w:noProof/>
               </w:rPr>
-              <w:instrText xml:space="preserve"> PAGEREF _Toc241624111 \h </w:instrText>
+              <w:instrText xml:space="preserve"> PAGEREF _Toc242128247 \h </w:instrText>
             </w:r>
             <w:r>
               <w:rPr>
@@ -2046,7 +2045,7 @@
               <w14:ligatures w14:val="standardContextual"/>
             </w:rPr>
           </w:pPr>
-          <w:hyperlink w:anchor="_Toc241624112" w:history="1">
+          <w:hyperlink w:anchor="_Toc242128248" w:history="1">
             <w:r>
               <w:rPr>
                 <w:rStyle w:val="Hyperlink"/>
@@ -2070,7 +2069,7 @@
               <w:rPr>
                 <w:noProof/>
               </w:rPr>
-              <w:instrText xml:space="preserve"> PAGEREF _Toc241624112 \h </w:instrText>
+              <w:instrText xml:space="preserve"> PAGEREF _Toc242128248 \h </w:instrText>
             </w:r>
             <w:r>
               <w:rPr>
@@ -2112,7 +2111,7 @@
               <w14:ligatures w14:val="standardContextual"/>
             </w:rPr>
           </w:pPr>
-          <w:hyperlink w:anchor="_Toc241624113" w:history="1">
+          <w:hyperlink w:anchor="_Toc242128249" w:history="1">
             <w:r>
               <w:rPr>
                 <w:rStyle w:val="Hyperlink"/>
@@ -2136,7 +2135,7 @@
               <w:rPr>
                 <w:noProof/>
               </w:rPr>
-              <w:instrText xml:space="preserve"> PAGEREF _Toc241624113 \h </w:instrText>
+              <w:instrText xml:space="preserve"> PAGEREF _Toc242128249 \h </w:instrText>
             </w:r>
             <w:r>
               <w:rPr>
@@ -2178,7 +2177,7 @@
               <w14:ligatures w14:val="standardContextual"/>
             </w:rPr>
           </w:pPr>
-          <w:hyperlink w:anchor="_Toc241624114" w:history="1">
+          <w:hyperlink w:anchor="_Toc242128250" w:history="1">
             <w:r>
               <w:rPr>
                 <w:rStyle w:val="Hyperlink"/>
@@ -2202,7 +2201,7 @@
               <w:rPr>
                 <w:noProof/>
               </w:rPr>
-              <w:instrText xml:space="preserve"> PAGEREF _Toc241624114 \h </w:instrText>
+              <w:instrText xml:space="preserve"> PAGEREF _Toc242128250 \h </w:instrText>
             </w:r>
             <w:r>
               <w:rPr>
@@ -2244,7 +2243,7 @@
               <w14:ligatures w14:val="standardContextual"/>
             </w:rPr>
           </w:pPr>
-          <w:hyperlink w:anchor="_Toc241624115" w:history="1">
+          <w:hyperlink w:anchor="_Toc242128251" w:history="1">
             <w:r>
               <w:rPr>
                 <w:rStyle w:val="Hyperlink"/>
@@ -2268,7 +2267,7 @@
               <w:rPr>
                 <w:noProof/>
               </w:rPr>
-              <w:instrText xml:space="preserve"> PAGEREF _Toc241624115 \h </w:instrText>
+              <w:instrText xml:space="preserve"> PAGEREF _Toc242128251 \h </w:instrText>
             </w:r>
             <w:r>
               <w:rPr>
@@ -2310,7 +2309,7 @@
               <w14:ligatures w14:val="standardContextual"/>
             </w:rPr>
           </w:pPr>
-          <w:hyperlink w:anchor="_Toc241624116" w:history="1">
+          <w:hyperlink w:anchor="_Toc242128252" w:history="1">
             <w:r>
               <w:rPr>
                 <w:rStyle w:val="Hyperlink"/>
@@ -2334,7 +2333,7 @@
               <w:rPr>
                 <w:noProof/>
               </w:rPr>
-              <w:instrText xml:space="preserve"> PAGEREF _Toc241624116 \h </w:instrText>
+              <w:instrText xml:space="preserve"> PAGEREF _Toc242128252 \h </w:instrText>
             </w:r>
             <w:r>
               <w:rPr>
@@ -2376,7 +2375,7 @@
               <w14:ligatures w14:val="standardContextual"/>
             </w:rPr>
           </w:pPr>
-          <w:hyperlink w:anchor="_Toc241624117" w:history="1">
+          <w:hyperlink w:anchor="_Toc242128253" w:history="1">
             <w:r>
               <w:rPr>
                 <w:rStyle w:val="Hyperlink"/>
@@ -2400,7 +2399,7 @@
               <w:rPr>
                 <w:noProof/>
               </w:rPr>
-              <w:instrText xml:space="preserve"> PAGEREF _Toc241624117 \h </w:instrText>
+              <w:instrText xml:space="preserve"> PAGEREF _Toc242128253 \h </w:instrText>
             </w:r>
             <w:r>
               <w:rPr>
@@ -2442,7 +2441,7 @@
               <w14:ligatures w14:val="standardContextual"/>
             </w:rPr>
           </w:pPr>
-          <w:hyperlink w:anchor="_Toc241624118" w:history="1">
+          <w:hyperlink w:anchor="_Toc242128254" w:history="1">
             <w:r>
               <w:rPr>
                 <w:rStyle w:val="Hyperlink"/>
@@ -2466,7 +2465,7 @@
               <w:rPr>
                 <w:noProof/>
               </w:rPr>
-              <w:instrText xml:space="preserve"> PAGEREF _Toc241624118 \h </w:instrText>
+              <w:instrText xml:space="preserve"> PAGEREF _Toc242128254 \h </w:instrText>
             </w:r>
             <w:r>
               <w:rPr>
@@ -2508,7 +2507,7 @@
               <w14:ligatures w14:val="standardContextual"/>
             </w:rPr>
           </w:pPr>
-          <w:hyperlink w:anchor="_Toc241624119" w:history="1">
+          <w:hyperlink w:anchor="_Toc242128255" w:history="1">
             <w:r>
               <w:rPr>
                 <w:rStyle w:val="Hyperlink"/>
@@ -2532,7 +2531,7 @@
               <w:rPr>
                 <w:noProof/>
               </w:rPr>
-              <w:instrText xml:space="preserve"> PAGEREF _Toc241624119 \h </w:instrText>
+              <w:instrText xml:space="preserve"> PAGEREF _Toc242128255 \h </w:instrText>
             </w:r>
             <w:r>
               <w:rPr>
@@ -2574,7 +2573,7 @@
               <w14:ligatures w14:val="standardContextual"/>
             </w:rPr>
           </w:pPr>
-          <w:hyperlink w:anchor="_Toc241624120" w:history="1">
+          <w:hyperlink w:anchor="_Toc242128256" w:history="1">
             <w:r>
               <w:rPr>
                 <w:rStyle w:val="Hyperlink"/>
@@ -2598,7 +2597,7 @@
               <w:rPr>
                 <w:noProof/>
               </w:rPr>
-              <w:instrText xml:space="preserve"> PAGEREF _Toc241624120 \h </w:instrText>
+              <w:instrText xml:space="preserve"> PAGEREF _Toc242128256 \h </w:instrText>
             </w:r>
             <w:r>
               <w:rPr>
@@ -2640,7 +2639,7 @@
               <w14:ligatures w14:val="standardContextual"/>
             </w:rPr>
           </w:pPr>
-          <w:hyperlink w:anchor="_Toc241624121" w:history="1">
+          <w:hyperlink w:anchor="_Toc242128257" w:history="1">
             <w:r>
               <w:rPr>
                 <w:rStyle w:val="Hyperlink"/>
@@ -2664,7 +2663,7 @@
               <w:rPr>
                 <w:noProof/>
               </w:rPr>
-              <w:instrText xml:space="preserve"> PAGEREF _Toc241624121 \h </w:instrText>
+              <w:instrText xml:space="preserve"> PAGEREF _Toc242128257 \h </w:instrText>
             </w:r>
             <w:r>
               <w:rPr>
@@ -2706,7 +2705,7 @@
               <w14:ligatures w14:val="standardContextual"/>
             </w:rPr>
           </w:pPr>
-          <w:hyperlink w:anchor="_Toc241624122" w:history="1">
+          <w:hyperlink w:anchor="_Toc242128258" w:history="1">
             <w:r>
               <w:rPr>
                 <w:rStyle w:val="Hyperlink"/>
@@ -2730,7 +2729,7 @@
               <w:rPr>
                 <w:noProof/>
               </w:rPr>
-              <w:instrText xml:space="preserve"> PAGEREF _Toc241624122 \h </w:instrText>
+              <w:instrText xml:space="preserve"> PAGEREF _Toc242128258 \h </w:instrText>
             </w:r>
             <w:r>
               <w:rPr>
@@ -2772,7 +2771,7 @@
               <w14:ligatures w14:val="standardContextual"/>
             </w:rPr>
           </w:pPr>
-          <w:hyperlink w:anchor="_Toc241624123" w:history="1">
+          <w:hyperlink w:anchor="_Toc242128259" w:history="1">
             <w:r>
               <w:rPr>
                 <w:rStyle w:val="Hyperlink"/>
@@ -2796,7 +2795,7 @@
               <w:rPr>
                 <w:noProof/>
               </w:rPr>
-              <w:instrText xml:space="preserve"> PAGEREF _Toc241624123 \h </w:instrText>
+              <w:instrText xml:space="preserve"> PAGEREF _Toc242128259 \h </w:instrText>
             </w:r>
             <w:r>
               <w:rPr>
@@ -2838,7 +2837,7 @@
               <w14:ligatures w14:val="standardContextual"/>
             </w:rPr>
           </w:pPr>
-          <w:hyperlink w:anchor="_Toc241624124" w:history="1">
+          <w:hyperlink w:anchor="_Toc242128260" w:history="1">
             <w:r>
               <w:rPr>
                 <w:rStyle w:val="Hyperlink"/>
@@ -2862,7 +2861,7 @@
               <w:rPr>
                 <w:noProof/>
               </w:rPr>
-              <w:instrText xml:space="preserve"> PAGEREF _Toc241624124 \h </w:instrText>
+              <w:instrText xml:space="preserve"> PAGEREF _Toc242128260 \h </w:instrText>
             </w:r>
             <w:r>
               <w:rPr>
@@ -2919,9 +2918,8 @@
         <w:pStyle w:val="Heading1"/>
         <w:pageBreakBefore/>
       </w:pPr>
-      <w:bookmarkStart w:id="0" w:name="_Toc241624084"/>
-      <w:r>
-        <w:lastRenderedPageBreak/>
+      <w:bookmarkStart w:id="0" w:name="_Toc242128220"/>
+      <w:r>
         <w:t>1. Abstract</w:t>
       </w:r>
       <w:bookmarkEnd w:id="0"/>
@@ -2998,9 +2996,8 @@
         <w:pStyle w:val="Heading1"/>
         <w:pageBreakBefore/>
       </w:pPr>
-      <w:bookmarkStart w:id="1" w:name="_Toc241624085"/>
-      <w:r>
-        <w:lastRenderedPageBreak/>
+      <w:bookmarkStart w:id="1" w:name="_Toc242128221"/>
+      <w:r>
         <w:t>2. Introduction</w:t>
       </w:r>
       <w:bookmarkEnd w:id="1"/>
@@ -3009,7 +3006,7 @@
       <w:pPr>
         <w:pStyle w:val="Heading2"/>
       </w:pPr>
-      <w:bookmarkStart w:id="2" w:name="_Toc241624086"/>
+      <w:bookmarkStart w:id="2" w:name="_Toc242128222"/>
       <w:r>
         <w:t>2.1 Problem Statement</w:t>
       </w:r>
@@ -3038,7 +3035,7 @@
       <w:pPr>
         <w:pStyle w:val="Heading2"/>
       </w:pPr>
-      <w:bookmarkStart w:id="3" w:name="_Toc241624087"/>
+      <w:bookmarkStart w:id="3" w:name="_Toc242128223"/>
       <w:r>
         <w:t>2.2 Objectives</w:t>
       </w:r>
@@ -3139,7 +3136,7 @@
       <w:pPr>
         <w:pStyle w:val="Heading2"/>
       </w:pPr>
-      <w:bookmarkStart w:id="4" w:name="_Toc241624088"/>
+      <w:bookmarkStart w:id="4" w:name="_Toc242128224"/>
       <w:r>
         <w:t>2.3 Scope</w:t>
       </w:r>
@@ -3159,9 +3156,8 @@
         <w:pStyle w:val="Heading1"/>
         <w:pageBreakBefore/>
       </w:pPr>
-      <w:bookmarkStart w:id="5" w:name="_Toc241624089"/>
-      <w:r>
-        <w:lastRenderedPageBreak/>
+      <w:bookmarkStart w:id="5" w:name="_Toc242128225"/>
+      <w:r>
         <w:t>3. Technology Stack</w:t>
       </w:r>
       <w:bookmarkEnd w:id="5"/>
@@ -3181,7 +3177,7 @@
           <w:left w:w="10" w:type="dxa"/>
           <w:right w:w="10" w:type="dxa"/>
         </w:tblCellMar>
-        <w:tblLook w:val="04A0" w:firstRow="1" w:lastRow="0" w:firstColumn="1" w:lastColumn="0" w:noHBand="0" w:noVBand="1"/>
+        <w:tblLook w:val="0000" w:firstRow="0" w:lastRow="0" w:firstColumn="0" w:lastColumn="0" w:noHBand="0" w:noVBand="0"/>
       </w:tblPr>
       <w:tblGrid>
         <w:gridCol w:w="1600"/>
@@ -3338,7 +3334,7 @@
                 <w:sz w:val="20"/>
                 <w:szCs w:val="20"/>
               </w:rPr>
-              <w:t>PostgreSQL 13+</w:t>
+              <w:t>PostgreSQL (hosted on Supabase)</w:t>
             </w:r>
           </w:p>
         </w:tc>
@@ -3364,7 +3360,7 @@
                 <w:sz w:val="20"/>
                 <w:szCs w:val="20"/>
               </w:rPr>
-              <w:t>Stores all data; enforces rules using constraints, triggers, functions, views and transactions</w:t>
+              <w:t>Stores all data; enforces rules using constraints, triggers, functions, views and transactions. Hosted on a Supabase cloud project (Mumbai region); a local PostgreSQL 15+ server also works</w:t>
             </w:r>
           </w:p>
         </w:tc>
@@ -3810,9 +3806,8 @@
         <w:pStyle w:val="Heading1"/>
         <w:pageBreakBefore/>
       </w:pPr>
-      <w:bookmarkStart w:id="6" w:name="_Toc241624090"/>
-      <w:r>
-        <w:lastRenderedPageBreak/>
+      <w:bookmarkStart w:id="6" w:name="_Toc242128226"/>
+      <w:r>
         <w:t>4. System Architecture</w:t>
       </w:r>
       <w:bookmarkEnd w:id="6"/>
@@ -3984,14 +3979,24 @@
         <w:t>data tier</w:t>
       </w:r>
       <w:r>
-        <w:t xml:space="preserve"> (PostgreSQL) stores data and enforces business rules through constraints and triggers, so the rules hold even if SQL is run directly on the database.</w:t>
+        <w:t xml:space="preserve"> (PostgreSQL on </w:t>
+      </w:r>
+      <w:r>
+        <w:rPr>
+          <w:b/>
+          <w:bCs/>
+        </w:rPr>
+        <w:t>Supabase</w:t>
+      </w:r>
+      <w:r>
+        <w:t>, connected over SSL through the Supabase connection pooler) stores data and enforces business rules through constraints and triggers, so the rules hold even if SQL is run directly on the database.</w:t>
       </w:r>
     </w:p>
     <w:p>
       <w:pPr>
         <w:pStyle w:val="Heading2"/>
       </w:pPr>
-      <w:bookmarkStart w:id="7" w:name="_Toc241624091"/>
+      <w:bookmarkStart w:id="7" w:name="_Toc242128227"/>
       <w:r>
         <w:t>4.1 Project Structure</w:t>
       </w:r>
@@ -4178,9 +4183,8 @@
         <w:pStyle w:val="Heading1"/>
         <w:pageBreakBefore/>
       </w:pPr>
-      <w:bookmarkStart w:id="8" w:name="_Toc241624092"/>
-      <w:r>
-        <w:lastRenderedPageBreak/>
+      <w:bookmarkStart w:id="8" w:name="_Toc242128228"/>
+      <w:r>
         <w:t>5. Database Design</w:t>
       </w:r>
       <w:bookmarkEnd w:id="8"/>
@@ -4189,7 +4193,7 @@
       <w:pPr>
         <w:pStyle w:val="Heading2"/>
       </w:pPr>
-      <w:bookmarkStart w:id="9" w:name="_Toc241624093"/>
+      <w:bookmarkStart w:id="9" w:name="_Toc242128229"/>
       <w:r>
         <w:t>5.1 Entities and Relationships</w:t>
       </w:r>
@@ -4473,7 +4477,7 @@
       <w:pPr>
         <w:pStyle w:val="Heading2"/>
       </w:pPr>
-      <w:bookmarkStart w:id="10" w:name="_Toc241624094"/>
+      <w:bookmarkStart w:id="10" w:name="_Toc242128230"/>
       <w:r>
         <w:t>5.2 Table Descriptions</w:t>
       </w:r>
@@ -4502,7 +4506,7 @@
           <w:left w:w="10" w:type="dxa"/>
           <w:right w:w="10" w:type="dxa"/>
         </w:tblCellMar>
-        <w:tblLook w:val="04A0" w:firstRow="1" w:lastRow="0" w:firstColumn="1" w:lastColumn="0" w:noHBand="0" w:noVBand="1"/>
+        <w:tblLook w:val="0000" w:firstRow="0" w:lastRow="0" w:firstColumn="0" w:lastColumn="0" w:noHBand="0" w:noVBand="0"/>
       </w:tblPr>
       <w:tblGrid>
         <w:gridCol w:w="2200"/>
@@ -5063,7 +5067,7 @@
           <w:left w:w="10" w:type="dxa"/>
           <w:right w:w="10" w:type="dxa"/>
         </w:tblCellMar>
-        <w:tblLook w:val="04A0" w:firstRow="1" w:lastRow="0" w:firstColumn="1" w:lastColumn="0" w:noHBand="0" w:noVBand="1"/>
+        <w:tblLook w:val="0000" w:firstRow="0" w:lastRow="0" w:firstColumn="0" w:lastColumn="0" w:noHBand="0" w:noVBand="0"/>
       </w:tblPr>
       <w:tblGrid>
         <w:gridCol w:w="2200"/>
@@ -5882,7 +5886,7 @@
           <w:left w:w="10" w:type="dxa"/>
           <w:right w:w="10" w:type="dxa"/>
         </w:tblCellMar>
-        <w:tblLook w:val="04A0" w:firstRow="1" w:lastRow="0" w:firstColumn="1" w:lastColumn="0" w:noHBand="0" w:noVBand="1"/>
+        <w:tblLook w:val="0000" w:firstRow="0" w:lastRow="0" w:firstColumn="0" w:lastColumn="0" w:noHBand="0" w:noVBand="0"/>
       </w:tblPr>
       <w:tblGrid>
         <w:gridCol w:w="2200"/>
@@ -6357,7 +6361,7 @@
           <w:left w:w="10" w:type="dxa"/>
           <w:right w:w="10" w:type="dxa"/>
         </w:tblCellMar>
-        <w:tblLook w:val="04A0" w:firstRow="1" w:lastRow="0" w:firstColumn="1" w:lastColumn="0" w:noHBand="0" w:noVBand="1"/>
+        <w:tblLook w:val="0000" w:firstRow="0" w:lastRow="0" w:firstColumn="0" w:lastColumn="0" w:noHBand="0" w:noVBand="0"/>
       </w:tblPr>
       <w:tblGrid>
         <w:gridCol w:w="2200"/>
@@ -6746,7 +6750,7 @@
           <w:left w:w="10" w:type="dxa"/>
           <w:right w:w="10" w:type="dxa"/>
         </w:tblCellMar>
-        <w:tblLook w:val="04A0" w:firstRow="1" w:lastRow="0" w:firstColumn="1" w:lastColumn="0" w:noHBand="0" w:noVBand="1"/>
+        <w:tblLook w:val="0000" w:firstRow="0" w:lastRow="0" w:firstColumn="0" w:lastColumn="0" w:noHBand="0" w:noVBand="0"/>
       </w:tblPr>
       <w:tblGrid>
         <w:gridCol w:w="2200"/>
@@ -7049,7 +7053,7 @@
           <w:left w:w="10" w:type="dxa"/>
           <w:right w:w="10" w:type="dxa"/>
         </w:tblCellMar>
-        <w:tblLook w:val="04A0" w:firstRow="1" w:lastRow="0" w:firstColumn="1" w:lastColumn="0" w:noHBand="0" w:noVBand="1"/>
+        <w:tblLook w:val="0000" w:firstRow="0" w:lastRow="0" w:firstColumn="0" w:lastColumn="0" w:noHBand="0" w:noVBand="0"/>
       </w:tblPr>
       <w:tblGrid>
         <w:gridCol w:w="2200"/>
@@ -7680,7 +7684,7 @@
           <w:left w:w="10" w:type="dxa"/>
           <w:right w:w="10" w:type="dxa"/>
         </w:tblCellMar>
-        <w:tblLook w:val="04A0" w:firstRow="1" w:lastRow="0" w:firstColumn="1" w:lastColumn="0" w:noHBand="0" w:noVBand="1"/>
+        <w:tblLook w:val="0000" w:firstRow="0" w:lastRow="0" w:firstColumn="0" w:lastColumn="0" w:noHBand="0" w:noVBand="0"/>
       </w:tblPr>
       <w:tblGrid>
         <w:gridCol w:w="2200"/>
@@ -8155,7 +8159,6 @@
                 <w:sz w:val="20"/>
                 <w:szCs w:val="20"/>
               </w:rPr>
-              <w:lastRenderedPageBreak/>
               <w:t>end_time</w:t>
             </w:r>
           </w:p>
@@ -8328,7 +8331,7 @@
           <w:left w:w="10" w:type="dxa"/>
           <w:right w:w="10" w:type="dxa"/>
         </w:tblCellMar>
-        <w:tblLook w:val="04A0" w:firstRow="1" w:lastRow="0" w:firstColumn="1" w:lastColumn="0" w:noHBand="0" w:noVBand="1"/>
+        <w:tblLook w:val="0000" w:firstRow="0" w:lastRow="0" w:firstColumn="0" w:lastColumn="0" w:noHBand="0" w:noVBand="0"/>
       </w:tblPr>
       <w:tblGrid>
         <w:gridCol w:w="2200"/>
@@ -8832,7 +8835,7 @@
           <w:left w:w="10" w:type="dxa"/>
           <w:right w:w="10" w:type="dxa"/>
         </w:tblCellMar>
-        <w:tblLook w:val="04A0" w:firstRow="1" w:lastRow="0" w:firstColumn="1" w:lastColumn="0" w:noHBand="0" w:noVBand="1"/>
+        <w:tblLook w:val="0000" w:firstRow="0" w:lastRow="0" w:firstColumn="0" w:lastColumn="0" w:noHBand="0" w:noVBand="0"/>
       </w:tblPr>
       <w:tblGrid>
         <w:gridCol w:w="2200"/>
@@ -9479,7 +9482,7 @@
           <w:left w:w="10" w:type="dxa"/>
           <w:right w:w="10" w:type="dxa"/>
         </w:tblCellMar>
-        <w:tblLook w:val="04A0" w:firstRow="1" w:lastRow="0" w:firstColumn="1" w:lastColumn="0" w:noHBand="0" w:noVBand="1"/>
+        <w:tblLook w:val="0000" w:firstRow="0" w:lastRow="0" w:firstColumn="0" w:lastColumn="0" w:noHBand="0" w:noVBand="0"/>
       </w:tblPr>
       <w:tblGrid>
         <w:gridCol w:w="2200"/>
@@ -9858,7 +9861,7 @@
       <w:pPr>
         <w:pStyle w:val="Heading2"/>
       </w:pPr>
-      <w:bookmarkStart w:id="11" w:name="_Toc241624095"/>
+      <w:bookmarkStart w:id="11" w:name="_Toc242128231"/>
       <w:r>
         <w:t>5.3 Normalisation</w:t>
       </w:r>
@@ -9917,7 +9920,6 @@
           <w:b/>
           <w:bCs/>
         </w:rPr>
-        <w:lastRenderedPageBreak/>
         <w:t>2NF</w:t>
       </w:r>
       <w:r>
@@ -9948,7 +9950,7 @@
       <w:pPr>
         <w:pStyle w:val="Heading2"/>
       </w:pPr>
-      <w:bookmarkStart w:id="12" w:name="_Toc241624096"/>
+      <w:bookmarkStart w:id="12" w:name="_Toc242128232"/>
       <w:r>
         <w:t>5.4 Indexes</w:t>
       </w:r>
@@ -9969,7 +9971,7 @@
           <w:left w:w="10" w:type="dxa"/>
           <w:right w:w="10" w:type="dxa"/>
         </w:tblCellMar>
-        <w:tblLook w:val="04A0" w:firstRow="1" w:lastRow="0" w:firstColumn="1" w:lastColumn="0" w:noHBand="0" w:noVBand="1"/>
+        <w:tblLook w:val="0000" w:firstRow="0" w:lastRow="0" w:firstColumn="0" w:lastColumn="0" w:noHBand="0" w:noVBand="0"/>
       </w:tblPr>
       <w:tblGrid>
         <w:gridCol w:w="4200"/>
@@ -10293,9 +10295,8 @@
         <w:pStyle w:val="Heading1"/>
         <w:pageBreakBefore/>
       </w:pPr>
-      <w:bookmarkStart w:id="13" w:name="_Toc241624097"/>
-      <w:r>
-        <w:lastRenderedPageBreak/>
+      <w:bookmarkStart w:id="13" w:name="_Toc242128233"/>
+      <w:r>
         <w:t>6. Features and How They Work</w:t>
       </w:r>
       <w:bookmarkEnd w:id="13"/>
@@ -10313,7 +10314,7 @@
       <w:pPr>
         <w:pStyle w:val="Heading2"/>
       </w:pPr>
-      <w:bookmarkStart w:id="14" w:name="_Toc241624098"/>
+      <w:bookmarkStart w:id="14" w:name="_Toc242128234"/>
       <w:r>
         <w:t>6.1 Theatre and Screen Management</w:t>
       </w:r>
@@ -10619,7 +10620,7 @@
       <w:pPr>
         <w:pStyle w:val="Heading2"/>
       </w:pPr>
-      <w:bookmarkStart w:id="15" w:name="_Toc241624099"/>
+      <w:bookmarkStart w:id="15" w:name="_Toc242128235"/>
       <w:r>
         <w:t>6.2 Movie Management</w:t>
       </w:r>
@@ -10687,7 +10688,7 @@
       <w:pPr>
         <w:pStyle w:val="Heading2"/>
       </w:pPr>
-      <w:bookmarkStart w:id="16" w:name="_Toc241624100"/>
+      <w:bookmarkStart w:id="16" w:name="_Toc242128236"/>
       <w:r>
         <w:t>6.3 Theatre Schedules (Show Scheduling)</w:t>
       </w:r>
@@ -10781,7 +10782,6 @@
         <w:spacing w:after="60" w:line="280" w:lineRule="auto"/>
       </w:pPr>
       <w:r>
-        <w:lastRenderedPageBreak/>
         <w:t xml:space="preserve">It reads the movie duration and sets </w:t>
       </w:r>
       <w:r>
@@ -11091,7 +11091,7 @@
       <w:pPr>
         <w:pStyle w:val="Heading2"/>
       </w:pPr>
-      <w:bookmarkStart w:id="17" w:name="_Toc241624101"/>
+      <w:bookmarkStart w:id="17" w:name="_Toc242128237"/>
       <w:r>
         <w:t>6.4 Browsing Shows</w:t>
       </w:r>
@@ -11251,9 +11251,8 @@
       <w:pPr>
         <w:pStyle w:val="Heading2"/>
       </w:pPr>
-      <w:bookmarkStart w:id="18" w:name="_Toc241624102"/>
-      <w:r>
-        <w:lastRenderedPageBreak/>
+      <w:bookmarkStart w:id="18" w:name="_Toc242128238"/>
+      <w:r>
         <w:t>6.5 Seat Reservation (Seat Map)</w:t>
       </w:r>
       <w:bookmarkEnd w:id="18"/>
@@ -11419,7 +11418,7 @@
       <w:pPr>
         <w:pStyle w:val="Heading2"/>
       </w:pPr>
-      <w:bookmarkStart w:id="19" w:name="_Toc241624103"/>
+      <w:bookmarkStart w:id="19" w:name="_Toc242128239"/>
       <w:r>
         <w:t>6.6 Dynamic Pricing</w:t>
       </w:r>
@@ -11504,7 +11503,7 @@
           <w:left w:w="10" w:type="dxa"/>
           <w:right w:w="10" w:type="dxa"/>
         </w:tblCellMar>
-        <w:tblLook w:val="04A0" w:firstRow="1" w:lastRow="0" w:firstColumn="1" w:lastColumn="0" w:noHBand="0" w:noVBand="1"/>
+        <w:tblLook w:val="0000" w:firstRow="0" w:lastRow="0" w:firstColumn="0" w:lastColumn="0" w:noHBand="0" w:noVBand="0"/>
       </w:tblPr>
       <w:tblGrid>
         <w:gridCol w:w="1800"/>
@@ -12180,7 +12179,6 @@
         <w:jc w:val="both"/>
       </w:pPr>
       <w:r>
-        <w:lastRenderedPageBreak/>
         <w:t xml:space="preserve">The price is copied into </w:t>
       </w:r>
       <w:r>
@@ -12200,7 +12198,7 @@
       <w:pPr>
         <w:pStyle w:val="Heading2"/>
       </w:pPr>
-      <w:bookmarkStart w:id="20" w:name="_Toc241624104"/>
+      <w:bookmarkStart w:id="20" w:name="_Toc242128240"/>
       <w:r>
         <w:t>6.7 Customer Booking</w:t>
       </w:r>
@@ -12513,7 +12511,7 @@
       <w:pPr>
         <w:pStyle w:val="Heading2"/>
       </w:pPr>
-      <w:bookmarkStart w:id="21" w:name="_Toc241624105"/>
+      <w:bookmarkStart w:id="21" w:name="_Toc242128241"/>
       <w:r>
         <w:t>6.8 Maximum 10 Tickets per Customer</w:t>
       </w:r>
@@ -12702,7 +12700,6 @@
           <w:sz w:val="18"/>
           <w:szCs w:val="18"/>
         </w:rPr>
-        <w:lastRenderedPageBreak/>
         <w:t>WHERE b.customer_id = v_customer AND b.show_id = v_show</w:t>
       </w:r>
     </w:p>
@@ -12793,7 +12790,7 @@
       <w:pPr>
         <w:pStyle w:val="Heading2"/>
       </w:pPr>
-      <w:bookmarkStart w:id="22" w:name="_Toc241624106"/>
+      <w:bookmarkStart w:id="22" w:name="_Toc242128242"/>
       <w:r>
         <w:t>6.9 View My Bookings</w:t>
       </w:r>
@@ -12871,7 +12868,7 @@
       <w:pPr>
         <w:pStyle w:val="Heading2"/>
       </w:pPr>
-      <w:bookmarkStart w:id="23" w:name="_Toc241624107"/>
+      <w:bookmarkStart w:id="23" w:name="_Toc242128243"/>
       <w:r>
         <w:t>6.10 Booking Cancellation</w:t>
       </w:r>
@@ -13022,7 +13019,7 @@
       <w:pPr>
         <w:pStyle w:val="Heading2"/>
       </w:pPr>
-      <w:bookmarkStart w:id="24" w:name="_Toc241624108"/>
+      <w:bookmarkStart w:id="24" w:name="_Toc242128244"/>
       <w:r>
         <w:t>6.11 Admin Panel</w:t>
       </w:r>
@@ -13165,7 +13162,6 @@
         <w:jc w:val="both"/>
       </w:pPr>
       <w:r>
-        <w:lastRenderedPageBreak/>
         <w:t>Any database error (e.g. overlapping show, invalid rating) is returned by the API and displayed on the page.</w:t>
       </w:r>
     </w:p>
@@ -13173,7 +13169,7 @@
       <w:pPr>
         <w:pStyle w:val="Heading2"/>
       </w:pPr>
-      <w:bookmarkStart w:id="25" w:name="_Toc241624109"/>
+      <w:bookmarkStart w:id="25" w:name="_Toc242128245"/>
       <w:r>
         <w:t>6.12 Reports</w:t>
       </w:r>
@@ -13398,9 +13394,8 @@
         <w:pStyle w:val="Heading1"/>
         <w:pageBreakBefore/>
       </w:pPr>
-      <w:bookmarkStart w:id="26" w:name="_Toc241624110"/>
-      <w:r>
-        <w:lastRenderedPageBreak/>
+      <w:bookmarkStart w:id="26" w:name="_Toc242128246"/>
+      <w:r>
         <w:t>7. Concurrent Transaction Management</w:t>
       </w:r>
       <w:bookmarkEnd w:id="26"/>
@@ -13409,7 +13404,7 @@
       <w:pPr>
         <w:pStyle w:val="Heading2"/>
       </w:pPr>
-      <w:bookmarkStart w:id="27" w:name="_Toc241624111"/>
+      <w:bookmarkStart w:id="27" w:name="_Toc242128247"/>
       <w:r>
         <w:t>7.1 The Problem</w:t>
       </w:r>
@@ -13449,7 +13444,7 @@
           <w:left w:w="10" w:type="dxa"/>
           <w:right w:w="10" w:type="dxa"/>
         </w:tblCellMar>
-        <w:tblLook w:val="04A0" w:firstRow="1" w:lastRow="0" w:firstColumn="1" w:lastColumn="0" w:noHBand="0" w:noVBand="1"/>
+        <w:tblLook w:val="0000" w:firstRow="0" w:lastRow="0" w:firstColumn="0" w:lastColumn="0" w:noHBand="0" w:noVBand="0"/>
       </w:tblPr>
       <w:tblGrid>
         <w:gridCol w:w="1200"/>
@@ -13892,7 +13887,7 @@
       <w:pPr>
         <w:pStyle w:val="Heading2"/>
       </w:pPr>
-      <w:bookmarkStart w:id="28" w:name="_Toc241624112"/>
+      <w:bookmarkStart w:id="28" w:name="_Toc242128248"/>
       <w:r>
         <w:t>7.2 The Solution: Row-Level Locking</w:t>
       </w:r>
@@ -14115,7 +14110,7 @@
           <w:left w:w="10" w:type="dxa"/>
           <w:right w:w="10" w:type="dxa"/>
         </w:tblCellMar>
-        <w:tblLook w:val="04A0" w:firstRow="1" w:lastRow="0" w:firstColumn="1" w:lastColumn="0" w:noHBand="0" w:noVBand="1"/>
+        <w:tblLook w:val="0000" w:firstRow="0" w:lastRow="0" w:firstColumn="0" w:lastColumn="0" w:noHBand="0" w:noVBand="0"/>
       </w:tblPr>
       <w:tblGrid>
         <w:gridCol w:w="1200"/>
@@ -14558,9 +14553,8 @@
       <w:pPr>
         <w:pStyle w:val="Heading2"/>
       </w:pPr>
-      <w:bookmarkStart w:id="29" w:name="_Toc241624113"/>
-      <w:r>
-        <w:lastRenderedPageBreak/>
+      <w:bookmarkStart w:id="29" w:name="_Toc242128249"/>
+      <w:r>
         <w:t>7.3 Deadlock Prevention</w:t>
       </w:r>
       <w:bookmarkEnd w:id="29"/>
@@ -14588,7 +14582,7 @@
       <w:pPr>
         <w:pStyle w:val="Heading2"/>
       </w:pPr>
-      <w:bookmarkStart w:id="30" w:name="_Toc241624114"/>
+      <w:bookmarkStart w:id="30" w:name="_Toc242128250"/>
       <w:r>
         <w:t>7.4 ACID Properties in the Project</w:t>
       </w:r>
@@ -14609,7 +14603,7 @@
           <w:left w:w="10" w:type="dxa"/>
           <w:right w:w="10" w:type="dxa"/>
         </w:tblCellMar>
-        <w:tblLook w:val="04A0" w:firstRow="1" w:lastRow="0" w:firstColumn="1" w:lastColumn="0" w:noHBand="0" w:noVBand="1"/>
+        <w:tblLook w:val="0000" w:firstRow="0" w:lastRow="0" w:firstColumn="0" w:lastColumn="0" w:noHBand="0" w:noVBand="0"/>
       </w:tblPr>
       <w:tblGrid>
         <w:gridCol w:w="1800"/>
@@ -14932,7 +14926,7 @@
       <w:pPr>
         <w:pStyle w:val="Heading2"/>
       </w:pPr>
-      <w:bookmarkStart w:id="31" w:name="_Toc241624115"/>
+      <w:bookmarkStart w:id="31" w:name="_Toc242128251"/>
       <w:r>
         <w:t>7.5 Proof: Concurrency Test</w:t>
       </w:r>
@@ -15143,9 +15137,8 @@
         <w:pStyle w:val="Heading1"/>
         <w:pageBreakBefore/>
       </w:pPr>
-      <w:bookmarkStart w:id="32" w:name="_Toc241624116"/>
-      <w:r>
-        <w:lastRenderedPageBreak/>
+      <w:bookmarkStart w:id="32" w:name="_Toc242128252"/>
+      <w:r>
         <w:t>8. DBMS Concepts Used</w:t>
       </w:r>
       <w:bookmarkEnd w:id="32"/>
@@ -15165,7 +15158,7 @@
           <w:left w:w="10" w:type="dxa"/>
           <w:right w:w="10" w:type="dxa"/>
         </w:tblCellMar>
-        <w:tblLook w:val="04A0" w:firstRow="1" w:lastRow="0" w:firstColumn="1" w:lastColumn="0" w:noHBand="0" w:noVBand="1"/>
+        <w:tblLook w:val="0000" w:firstRow="0" w:lastRow="0" w:firstColumn="0" w:lastColumn="0" w:noHBand="0" w:noVBand="0"/>
       </w:tblPr>
       <w:tblGrid>
         <w:gridCol w:w="3400"/>
@@ -16138,6 +16131,126 @@
           </w:p>
         </w:tc>
       </w:tr>
+      <w:tr>
+        <w:tblPrEx>
+          <w:tblCellMar>
+            <w:top w:w="0" w:type="dxa"/>
+            <w:bottom w:w="0" w:type="dxa"/>
+          </w:tblCellMar>
+        </w:tblPrEx>
+        <w:tc>
+          <w:tcPr>
+            <w:tcW w:w="3400" w:type="dxa"/>
+            <w:tcBorders>
+              <w:top w:val="single" w:sz="4" w:space="0" w:color="D1D5DB"/>
+              <w:left w:val="single" w:sz="4" w:space="0" w:color="D1D5DB"/>
+              <w:bottom w:val="single" w:sz="4" w:space="0" w:color="D1D5DB"/>
+              <w:right w:val="single" w:sz="4" w:space="0" w:color="D1D5DB"/>
+            </w:tcBorders>
+            <w:tcMar>
+              <w:top w:w="60" w:type="dxa"/>
+              <w:left w:w="100" w:type="dxa"/>
+              <w:bottom w:w="60" w:type="dxa"/>
+              <w:right w:w="100" w:type="dxa"/>
+            </w:tcMar>
+          </w:tcPr>
+          <w:p>
+            <w:r>
+              <w:rPr>
+                <w:sz w:val="20"/>
+                <w:szCs w:val="20"/>
+              </w:rPr>
+              <w:t>Row Level Security (RLS)</w:t>
+            </w:r>
+          </w:p>
+        </w:tc>
+        <w:tc>
+          <w:tcPr>
+            <w:tcW w:w="5626" w:type="dxa"/>
+            <w:tcBorders>
+              <w:top w:val="single" w:sz="4" w:space="0" w:color="D1D5DB"/>
+              <w:left w:val="single" w:sz="4" w:space="0" w:color="D1D5DB"/>
+              <w:bottom w:val="single" w:sz="4" w:space="0" w:color="D1D5DB"/>
+              <w:right w:val="single" w:sz="4" w:space="0" w:color="D1D5DB"/>
+            </w:tcBorders>
+            <w:tcMar>
+              <w:top w:w="60" w:type="dxa"/>
+              <w:left w:w="100" w:type="dxa"/>
+              <w:bottom w:w="60" w:type="dxa"/>
+              <w:right w:w="100" w:type="dxa"/>
+            </w:tcMar>
+          </w:tcPr>
+          <w:p>
+            <w:r>
+              <w:rPr>
+                <w:sz w:val="20"/>
+                <w:szCs w:val="20"/>
+              </w:rPr>
+              <w:t>Enabled on all tables on Supabase so data is reachable only through the project API</w:t>
+            </w:r>
+          </w:p>
+        </w:tc>
+      </w:tr>
+      <w:tr>
+        <w:tblPrEx>
+          <w:tblCellMar>
+            <w:top w:w="0" w:type="dxa"/>
+            <w:bottom w:w="0" w:type="dxa"/>
+          </w:tblCellMar>
+        </w:tblPrEx>
+        <w:tc>
+          <w:tcPr>
+            <w:tcW w:w="3400" w:type="dxa"/>
+            <w:tcBorders>
+              <w:top w:val="single" w:sz="4" w:space="0" w:color="D1D5DB"/>
+              <w:left w:val="single" w:sz="4" w:space="0" w:color="D1D5DB"/>
+              <w:bottom w:val="single" w:sz="4" w:space="0" w:color="D1D5DB"/>
+              <w:right w:val="single" w:sz="4" w:space="0" w:color="D1D5DB"/>
+            </w:tcBorders>
+            <w:tcMar>
+              <w:top w:w="60" w:type="dxa"/>
+              <w:left w:w="100" w:type="dxa"/>
+              <w:bottom w:w="60" w:type="dxa"/>
+              <w:right w:w="100" w:type="dxa"/>
+            </w:tcMar>
+          </w:tcPr>
+          <w:p>
+            <w:r>
+              <w:rPr>
+                <w:sz w:val="20"/>
+                <w:szCs w:val="20"/>
+              </w:rPr>
+              <w:t>Roles &amp; privileges</w:t>
+            </w:r>
+          </w:p>
+        </w:tc>
+        <w:tc>
+          <w:tcPr>
+            <w:tcW w:w="5626" w:type="dxa"/>
+            <w:tcBorders>
+              <w:top w:val="single" w:sz="4" w:space="0" w:color="D1D5DB"/>
+              <w:left w:val="single" w:sz="4" w:space="0" w:color="D1D5DB"/>
+              <w:bottom w:val="single" w:sz="4" w:space="0" w:color="D1D5DB"/>
+              <w:right w:val="single" w:sz="4" w:space="0" w:color="D1D5DB"/>
+            </w:tcBorders>
+            <w:tcMar>
+              <w:top w:w="60" w:type="dxa"/>
+              <w:left w:w="100" w:type="dxa"/>
+              <w:bottom w:w="60" w:type="dxa"/>
+              <w:right w:w="100" w:type="dxa"/>
+            </w:tcMar>
+          </w:tcPr>
+          <w:p>
+            <w:r>
+              <w:rPr>
+                <w:sz w:val="20"/>
+                <w:szCs w:val="20"/>
+              </w:rPr>
+              <w:t>Dedicated login role movie_app owns the tables; session time zone set to Asia/Kolkata</w:t>
+            </w:r>
+          </w:p>
+        </w:tc>
+      </w:tr>
     </w:tbl>
     <w:p>
       <w:pPr>
@@ -16149,9 +16262,8 @@
         <w:pStyle w:val="Heading1"/>
         <w:pageBreakBefore/>
       </w:pPr>
-      <w:bookmarkStart w:id="33" w:name="_Toc241624117"/>
-      <w:r>
-        <w:lastRenderedPageBreak/>
+      <w:bookmarkStart w:id="33" w:name="_Toc242128253"/>
+      <w:r>
         <w:t>9. REST API Endpoints</w:t>
       </w:r>
       <w:bookmarkEnd w:id="33"/>
@@ -16171,7 +16283,7 @@
           <w:left w:w="10" w:type="dxa"/>
           <w:right w:w="10" w:type="dxa"/>
         </w:tblCellMar>
-        <w:tblLook w:val="04A0" w:firstRow="1" w:lastRow="0" w:firstColumn="1" w:lastColumn="0" w:noHBand="0" w:noVBand="1"/>
+        <w:tblLook w:val="0000" w:firstRow="0" w:lastRow="0" w:firstColumn="0" w:lastColumn="0" w:noHBand="0" w:noVBand="0"/>
       </w:tblPr>
       <w:tblGrid>
         <w:gridCol w:w="1200"/>
@@ -17660,9 +17772,8 @@
         <w:pStyle w:val="Heading1"/>
         <w:pageBreakBefore/>
       </w:pPr>
-      <w:bookmarkStart w:id="34" w:name="_Toc241624118"/>
-      <w:r>
-        <w:lastRenderedPageBreak/>
+      <w:bookmarkStart w:id="34" w:name="_Toc242128254"/>
+      <w:r>
         <w:t>10. User Interface</w:t>
       </w:r>
       <w:bookmarkEnd w:id="34"/>
@@ -17682,7 +17793,7 @@
           <w:left w:w="10" w:type="dxa"/>
           <w:right w:w="10" w:type="dxa"/>
         </w:tblCellMar>
-        <w:tblLook w:val="04A0" w:firstRow="1" w:lastRow="0" w:firstColumn="1" w:lastColumn="0" w:noHBand="0" w:noVBand="1"/>
+        <w:tblLook w:val="0000" w:firstRow="0" w:lastRow="0" w:firstColumn="0" w:lastColumn="0" w:noHBand="0" w:noVBand="0"/>
       </w:tblPr>
       <w:tblGrid>
         <w:gridCol w:w="2000"/>
@@ -18015,9 +18126,8 @@
         <w:pStyle w:val="Heading1"/>
         <w:pageBreakBefore/>
       </w:pPr>
-      <w:bookmarkStart w:id="35" w:name="_Toc241624119"/>
-      <w:r>
-        <w:lastRenderedPageBreak/>
+      <w:bookmarkStart w:id="35" w:name="_Toc242128255"/>
+      <w:r>
         <w:t>11. Testing</w:t>
       </w:r>
       <w:bookmarkEnd w:id="35"/>
@@ -18037,7 +18147,7 @@
           <w:left w:w="10" w:type="dxa"/>
           <w:right w:w="10" w:type="dxa"/>
         </w:tblCellMar>
-        <w:tblLook w:val="04A0" w:firstRow="1" w:lastRow="0" w:firstColumn="1" w:lastColumn="0" w:noHBand="0" w:noVBand="1"/>
+        <w:tblLook w:val="0000" w:firstRow="0" w:lastRow="0" w:firstColumn="0" w:lastColumn="0" w:noHBand="0" w:noVBand="0"/>
       </w:tblPr>
       <w:tblGrid>
         <w:gridCol w:w="500"/>
@@ -19299,9 +19409,8 @@
         <w:pStyle w:val="Heading1"/>
         <w:pageBreakBefore/>
       </w:pPr>
-      <w:bookmarkStart w:id="36" w:name="_Toc241624120"/>
-      <w:r>
-        <w:lastRenderedPageBreak/>
+      <w:bookmarkStart w:id="36" w:name="_Toc242128256"/>
+      <w:r>
         <w:t>12. How to Run the Project</w:t>
       </w:r>
       <w:bookmarkEnd w:id="36"/>
@@ -19319,7 +19428,7 @@
         <w:t>Requirements:</w:t>
       </w:r>
       <w:r>
-        <w:t xml:space="preserve"> Node.js 18+ and PostgreSQL 13+.</w:t>
+        <w:t xml:space="preserve"> Node.js 18+ and a Supabase project (or local PostgreSQL 15+).</w:t>
       </w:r>
     </w:p>
     <w:p>
@@ -19412,10 +19521,10 @@
           <w:sz w:val="20"/>
           <w:szCs w:val="20"/>
         </w:rPr>
-        <w:t>DB_PASSWORD</w:t>
-      </w:r>
-      <w:r>
-        <w:t xml:space="preserve"> to your PostgreSQL password.</w:t>
+        <w:t>DATABASE_URL</w:t>
+      </w:r>
+      <w:r>
+        <w:t xml:space="preserve"> to the Supabase Session pooler connection string (or fill the local PostgreSQL settings).</w:t>
       </w:r>
     </w:p>
     <w:p>
@@ -19524,17 +19633,27 @@
         <w:jc w:val="both"/>
       </w:pPr>
       <w:r>
-        <w:t xml:space="preserve">The database can be viewed in </w:t>
+        <w:t xml:space="preserve">The database can be viewed in the </w:t>
       </w:r>
       <w:r>
         <w:rPr>
           <w:b/>
           <w:bCs/>
         </w:rPr>
+        <w:t>Supabase dashboard</w:t>
+      </w:r>
+      <w:r>
+        <w:t xml:space="preserve"> (Table Editor and SQL Editor), or in </w:t>
+      </w:r>
+      <w:r>
+        <w:rPr>
+          <w:b/>
+          <w:bCs/>
+        </w:rPr>
         <w:t>pgAdmin 4</w:t>
       </w:r>
       <w:r>
-        <w:t xml:space="preserve"> under Servers → PostgreSQL → Databases → movie_booking → Schemas → public.</w:t>
+        <w:t xml:space="preserve"> when using local PostgreSQL.</w:t>
       </w:r>
     </w:p>
     <w:p>
@@ -19542,9 +19661,8 @@
         <w:pStyle w:val="Heading1"/>
         <w:pageBreakBefore/>
       </w:pPr>
-      <w:bookmarkStart w:id="37" w:name="_Toc241624121"/>
-      <w:r>
-        <w:lastRenderedPageBreak/>
+      <w:bookmarkStart w:id="37" w:name="_Toc242128257"/>
+      <w:r>
         <w:t>13. Conclusion and Future Scope</w:t>
       </w:r>
       <w:bookmarkEnd w:id="37"/>
@@ -19553,7 +19671,7 @@
       <w:pPr>
         <w:pStyle w:val="Heading2"/>
       </w:pPr>
-      <w:bookmarkStart w:id="38" w:name="_Toc241624122"/>
+      <w:bookmarkStart w:id="38" w:name="_Toc242128258"/>
       <w:r>
         <w:t>13.1 Conclusion</w:t>
       </w:r>
@@ -19575,7 +19693,7 @@
       <w:pPr>
         <w:pStyle w:val="Heading2"/>
       </w:pPr>
-      <w:bookmarkStart w:id="39" w:name="_Toc241624123"/>
+      <w:bookmarkStart w:id="39" w:name="_Toc242128259"/>
       <w:r>
         <w:t>13.2 Future Scope</w:t>
       </w:r>
@@ -19663,7 +19781,7 @@
       <w:pPr>
         <w:pStyle w:val="Heading2"/>
       </w:pPr>
-      <w:bookmarkStart w:id="40" w:name="_Toc241624124"/>
+      <w:bookmarkStart w:id="40" w:name="_Toc242128260"/>
       <w:r>
         <w:t>13.3 References</w:t>
       </w:r>
@@ -19878,10 +19996,96 @@
 <file path=word/numbering.xml><?xml version="1.0" encoding="utf-8"?>
 <w:numbering xmlns:wpc="http://schemas.microsoft.com/office/word/2010/wordprocessingCanvas" xmlns:cx="http://schemas.microsoft.com/office/drawing/2014/chartex" xmlns:cx1="http://schemas.microsoft.com/office/drawing/2015/9/8/chartex" xmlns:cx2="http://schemas.microsoft.com/office/drawing/2015/10/21/chartex" xmlns:cx3="http://schemas.microsoft.com/office/drawing/2016/5/9/chartex" xmlns:cx4="http://schemas.microsoft.com/office/drawing/2016/5/10/chartex" xmlns:cx5="http://schemas.microsoft.com/office/drawing/2016/5/11/chartex" xmlns:cx6="http://schemas.microsoft.com/office/drawing/2016/5/12/chartex" xmlns:cx7="http://schemas.microsoft.com/office/drawing/2016/5/13/chartex" xmlns:cx8="http://schemas.microsoft.com/office/drawing/2016/5/14/chartex" xmlns:mc="http://schemas.openxmlformats.org/markup-compatibility/2006" xmlns:aink="http://schemas.microsoft.com/office/drawing/2016/ink" xmlns:am3d="http://schemas.microsoft.com/office/drawing/2017/model3d" xmlns:o="urn:schemas-microsoft-com:office:office" xmlns:oel="http://schemas.microsoft.com/office/2019/extlst" xmlns:r="http://schemas.openxmlformats.org/officeDocument/2006/relationships" xmlns:m="http://schemas.openxmlformats.org/officeDocument/2006/math" xmlns:v="urn:schemas-microsoft-com:vml" xmlns:wp14="http://schemas.microsoft.com/office/word/2010/wordprocessingDrawing" xmlns:wp="http://schemas.openxmlformats.org/drawingml/2006/wordprocessingDrawing" xmlns:w10="urn:schemas-microsoft-com:office:word" xmlns:w="http://schemas.openxmlformats.org/wordprocessingml/2006/main" xmlns:w14="http://schemas.microsoft.com/office/word/2010/wordml" xmlns:w15="http://schemas.microsoft.com/office/word/2012/wordml" xmlns:w16cex="http://schemas.microsoft.com/office/word/2018/wordml/cex" xmlns:w16cid="http://schemas.microsoft.com/office/word/2016/wordml/cid" xmlns:w16="http://schemas.microsoft.com/office/word/2018/wordml" xmlns:w16du="http://schemas.microsoft.com/office/word/2023/wordml/word16du" xmlns:w16sdtdh="http://schemas.microsoft.com/office/word/2020/wordml/sdtdatahash" xmlns:w16sdtfl="http://schemas.microsoft.com/office/word/2024/wordml/sdtformatlock" xmlns:w16se="http://schemas.microsoft.com/office/word/2015/wordml/symex" xmlns:wpg="http://schemas.microsoft.com/office/word/2010/wordprocessingGroup" xmlns:wpi="http://schemas.microsoft.com/office/word/2010/wordprocessingInk" xmlns:wne="http://schemas.microsoft.com/office/word/2006/wordml" xmlns:wps="http://schemas.microsoft.com/office/word/2010/wordprocessingShape" mc:Ignorable="w14 w15 w16se w16cid w16 w16cex w16sdtdh w16sdtfl w16du wp14">
   <w:abstractNum w:abstractNumId="0" w15:restartNumberingAfterBreak="0">
-    <w:nsid w:val="08956331"/>
+    <w:nsid w:val="1A3C2554"/>
     <w:multiLevelType w:val="hybridMultilevel"/>
-    <w:tmpl w:val="1D98C100"/>
-    <w:lvl w:ilvl="0" w:tplc="D5D29372">
+    <w:tmpl w:val="BDEA61EE"/>
+    <w:lvl w:ilvl="0" w:tplc="443C0BBC" w:tentative="1">
+      <w:start w:val="1"/>
+      <w:numFmt w:val="bullet"/>
+      <w:lvlText w:val="●"/>
+      <w:lvlJc w:val="left"/>
+      <w:pPr>
+        <w:ind w:left="720" w:hanging="360"/>
+      </w:pPr>
+    </w:lvl>
+    <w:lvl w:ilvl="1" w:tplc="8820BE32" w:tentative="1">
+      <w:start w:val="1"/>
+      <w:numFmt w:val="bullet"/>
+      <w:lvlText w:val="○"/>
+      <w:lvlJc w:val="left"/>
+      <w:pPr>
+        <w:ind w:left="1440" w:hanging="360"/>
+      </w:pPr>
+    </w:lvl>
+    <w:lvl w:ilvl="2" w:tplc="0D084B68" w:tentative="1">
+      <w:start w:val="1"/>
+      <w:numFmt w:val="bullet"/>
+      <w:lvlText w:val="■"/>
+      <w:lvlJc w:val="left"/>
+      <w:pPr>
+        <w:ind w:left="2160" w:hanging="360"/>
+      </w:pPr>
+    </w:lvl>
+    <w:lvl w:ilvl="3" w:tplc="26AAC5DE" w:tentative="1">
+      <w:start w:val="1"/>
+      <w:numFmt w:val="bullet"/>
+      <w:lvlText w:val="●"/>
+      <w:lvlJc w:val="left"/>
+      <w:pPr>
+        <w:ind w:left="2880" w:hanging="360"/>
+      </w:pPr>
+    </w:lvl>
+    <w:lvl w:ilvl="4" w:tplc="56D2468C" w:tentative="1">
+      <w:start w:val="1"/>
+      <w:numFmt w:val="bullet"/>
+      <w:lvlText w:val="○"/>
+      <w:lvlJc w:val="left"/>
+      <w:pPr>
+        <w:ind w:left="3600" w:hanging="360"/>
+      </w:pPr>
+    </w:lvl>
+    <w:lvl w:ilvl="5" w:tplc="E1C03578" w:tentative="1">
+      <w:start w:val="1"/>
+      <w:numFmt w:val="bullet"/>
+      <w:lvlText w:val="■"/>
+      <w:lvlJc w:val="left"/>
+      <w:pPr>
+        <w:ind w:left="4320" w:hanging="360"/>
+      </w:pPr>
+    </w:lvl>
+    <w:lvl w:ilvl="6" w:tplc="916C514A" w:tentative="1">
+      <w:start w:val="1"/>
+      <w:numFmt w:val="bullet"/>
+      <w:lvlText w:val="●"/>
+      <w:lvlJc w:val="left"/>
+      <w:pPr>
+        <w:ind w:left="5040" w:hanging="360"/>
+      </w:pPr>
+    </w:lvl>
+    <w:lvl w:ilvl="7" w:tplc="E88C086C" w:tentative="1">
+      <w:start w:val="1"/>
+      <w:numFmt w:val="bullet"/>
+      <w:lvlText w:val="●"/>
+      <w:lvlJc w:val="left"/>
+      <w:pPr>
+        <w:ind w:left="5760" w:hanging="360"/>
+      </w:pPr>
+    </w:lvl>
+    <w:lvl w:ilvl="8" w:tplc="967C7A50" w:tentative="1">
+      <w:start w:val="1"/>
+      <w:numFmt w:val="bullet"/>
+      <w:lvlText w:val="●"/>
+      <w:lvlJc w:val="left"/>
+      <w:pPr>
+        <w:ind w:left="6480" w:hanging="360"/>
+      </w:pPr>
+    </w:lvl>
+  </w:abstractNum>
+  <w:abstractNum w:abstractNumId="1" w15:restartNumberingAfterBreak="0">
+    <w:nsid w:val="1BB51E04"/>
+    <w:multiLevelType w:val="hybridMultilevel"/>
+    <w:tmpl w:val="8892E380"/>
+    <w:lvl w:ilvl="0" w:tplc="30B2ADE2">
       <w:start w:val="1"/>
       <w:numFmt w:val="decimal"/>
       <w:lvlText w:val="%1."/>
@@ -19890,138 +20094,52 @@
         <w:ind w:left="540" w:hanging="360"/>
       </w:pPr>
     </w:lvl>
-    <w:lvl w:ilvl="1" w:tplc="F898781C">
+    <w:lvl w:ilvl="1" w:tplc="28767FDE">
       <w:numFmt w:val="decimal"/>
       <w:lvlText w:val=""/>
       <w:lvlJc w:val="left"/>
     </w:lvl>
-    <w:lvl w:ilvl="2" w:tplc="70781B7A">
+    <w:lvl w:ilvl="2" w:tplc="0840B7FC">
       <w:numFmt w:val="decimal"/>
       <w:lvlText w:val=""/>
       <w:lvlJc w:val="left"/>
     </w:lvl>
-    <w:lvl w:ilvl="3" w:tplc="63FE9EB4">
+    <w:lvl w:ilvl="3" w:tplc="E0D855E2">
       <w:numFmt w:val="decimal"/>
       <w:lvlText w:val=""/>
       <w:lvlJc w:val="left"/>
     </w:lvl>
-    <w:lvl w:ilvl="4" w:tplc="D0C81B28">
+    <w:lvl w:ilvl="4" w:tplc="1AC41C0E">
       <w:numFmt w:val="decimal"/>
       <w:lvlText w:val=""/>
       <w:lvlJc w:val="left"/>
     </w:lvl>
-    <w:lvl w:ilvl="5" w:tplc="269A466C">
+    <w:lvl w:ilvl="5" w:tplc="A6300452">
       <w:numFmt w:val="decimal"/>
       <w:lvlText w:val=""/>
       <w:lvlJc w:val="left"/>
     </w:lvl>
-    <w:lvl w:ilvl="6" w:tplc="3458873E">
+    <w:lvl w:ilvl="6" w:tplc="2A8A6544">
       <w:numFmt w:val="decimal"/>
       <w:lvlText w:val=""/>
       <w:lvlJc w:val="left"/>
     </w:lvl>
-    <w:lvl w:ilvl="7" w:tplc="B60A0C88">
+    <w:lvl w:ilvl="7" w:tplc="7FF44250">
       <w:numFmt w:val="decimal"/>
       <w:lvlText w:val=""/>
       <w:lvlJc w:val="left"/>
     </w:lvl>
-    <w:lvl w:ilvl="8" w:tplc="25E07B20">
+    <w:lvl w:ilvl="8" w:tplc="8D322DFC">
       <w:numFmt w:val="decimal"/>
       <w:lvlText w:val=""/>
       <w:lvlJc w:val="left"/>
     </w:lvl>
   </w:abstractNum>
-  <w:abstractNum w:abstractNumId="1" w15:restartNumberingAfterBreak="0">
-    <w:nsid w:val="289F11FA"/>
+  <w:abstractNum w:abstractNumId="2" w15:restartNumberingAfterBreak="0">
+    <w:nsid w:val="2BF22CAF"/>
     <w:multiLevelType w:val="hybridMultilevel"/>
-    <w:tmpl w:val="D792A640"/>
-    <w:lvl w:ilvl="0" w:tplc="653651DE" w:tentative="1">
-      <w:start w:val="1"/>
-      <w:numFmt w:val="bullet"/>
-      <w:lvlText w:val="●"/>
-      <w:lvlJc w:val="left"/>
-      <w:pPr>
-        <w:ind w:left="720" w:hanging="360"/>
-      </w:pPr>
-    </w:lvl>
-    <w:lvl w:ilvl="1" w:tplc="427A9950" w:tentative="1">
-      <w:start w:val="1"/>
-      <w:numFmt w:val="bullet"/>
-      <w:lvlText w:val="○"/>
-      <w:lvlJc w:val="left"/>
-      <w:pPr>
-        <w:ind w:left="1440" w:hanging="360"/>
-      </w:pPr>
-    </w:lvl>
-    <w:lvl w:ilvl="2" w:tplc="F934E4CA" w:tentative="1">
-      <w:start w:val="1"/>
-      <w:numFmt w:val="bullet"/>
-      <w:lvlText w:val="■"/>
-      <w:lvlJc w:val="left"/>
-      <w:pPr>
-        <w:ind w:left="2160" w:hanging="360"/>
-      </w:pPr>
-    </w:lvl>
-    <w:lvl w:ilvl="3" w:tplc="C638D54C" w:tentative="1">
-      <w:start w:val="1"/>
-      <w:numFmt w:val="bullet"/>
-      <w:lvlText w:val="●"/>
-      <w:lvlJc w:val="left"/>
-      <w:pPr>
-        <w:ind w:left="2880" w:hanging="360"/>
-      </w:pPr>
-    </w:lvl>
-    <w:lvl w:ilvl="4" w:tplc="575820C2" w:tentative="1">
-      <w:start w:val="1"/>
-      <w:numFmt w:val="bullet"/>
-      <w:lvlText w:val="○"/>
-      <w:lvlJc w:val="left"/>
-      <w:pPr>
-        <w:ind w:left="3600" w:hanging="360"/>
-      </w:pPr>
-    </w:lvl>
-    <w:lvl w:ilvl="5" w:tplc="2D823E20" w:tentative="1">
-      <w:start w:val="1"/>
-      <w:numFmt w:val="bullet"/>
-      <w:lvlText w:val="■"/>
-      <w:lvlJc w:val="left"/>
-      <w:pPr>
-        <w:ind w:left="4320" w:hanging="360"/>
-      </w:pPr>
-    </w:lvl>
-    <w:lvl w:ilvl="6" w:tplc="CA26D1A8" w:tentative="1">
-      <w:start w:val="1"/>
-      <w:numFmt w:val="bullet"/>
-      <w:lvlText w:val="●"/>
-      <w:lvlJc w:val="left"/>
-      <w:pPr>
-        <w:ind w:left="5040" w:hanging="360"/>
-      </w:pPr>
-    </w:lvl>
-    <w:lvl w:ilvl="7" w:tplc="D80E3366" w:tentative="1">
-      <w:start w:val="1"/>
-      <w:numFmt w:val="bullet"/>
-      <w:lvlText w:val="●"/>
-      <w:lvlJc w:val="left"/>
-      <w:pPr>
-        <w:ind w:left="5760" w:hanging="360"/>
-      </w:pPr>
-    </w:lvl>
-    <w:lvl w:ilvl="8" w:tplc="3ADC9980" w:tentative="1">
-      <w:start w:val="1"/>
-      <w:numFmt w:val="bullet"/>
-      <w:lvlText w:val="●"/>
-      <w:lvlJc w:val="left"/>
-      <w:pPr>
-        <w:ind w:left="6480" w:hanging="360"/>
-      </w:pPr>
-    </w:lvl>
-  </w:abstractNum>
-  <w:abstractNum w:abstractNumId="2" w15:restartNumberingAfterBreak="0">
-    <w:nsid w:val="2A065D9E"/>
-    <w:multiLevelType w:val="hybridMultilevel"/>
-    <w:tmpl w:val="9B605F36"/>
-    <w:lvl w:ilvl="0" w:tplc="08DC4C72">
+    <w:tmpl w:val="00B43438"/>
+    <w:lvl w:ilvl="0" w:tplc="9EB874BA">
       <w:start w:val="1"/>
       <w:numFmt w:val="decimal"/>
       <w:lvlText w:val="%1."/>
@@ -20030,52 +20148,52 @@
         <w:ind w:left="540" w:hanging="360"/>
       </w:pPr>
     </w:lvl>
-    <w:lvl w:ilvl="1" w:tplc="0EBCADE2">
+    <w:lvl w:ilvl="1" w:tplc="7DC2ECD2">
       <w:numFmt w:val="decimal"/>
       <w:lvlText w:val=""/>
       <w:lvlJc w:val="left"/>
     </w:lvl>
-    <w:lvl w:ilvl="2" w:tplc="29AAE860">
+    <w:lvl w:ilvl="2" w:tplc="EF2C1656">
       <w:numFmt w:val="decimal"/>
       <w:lvlText w:val=""/>
       <w:lvlJc w:val="left"/>
     </w:lvl>
-    <w:lvl w:ilvl="3" w:tplc="714C04CA">
+    <w:lvl w:ilvl="3" w:tplc="276471B6">
       <w:numFmt w:val="decimal"/>
       <w:lvlText w:val=""/>
       <w:lvlJc w:val="left"/>
     </w:lvl>
-    <w:lvl w:ilvl="4" w:tplc="1A72F40A">
+    <w:lvl w:ilvl="4" w:tplc="E6341258">
       <w:numFmt w:val="decimal"/>
       <w:lvlText w:val=""/>
       <w:lvlJc w:val="left"/>
     </w:lvl>
-    <w:lvl w:ilvl="5" w:tplc="BAA012EA">
+    <w:lvl w:ilvl="5" w:tplc="322E723A">
       <w:numFmt w:val="decimal"/>
       <w:lvlText w:val=""/>
       <w:lvlJc w:val="left"/>
     </w:lvl>
-    <w:lvl w:ilvl="6" w:tplc="DC32291C">
+    <w:lvl w:ilvl="6" w:tplc="8850FDDC">
       <w:numFmt w:val="decimal"/>
       <w:lvlText w:val=""/>
       <w:lvlJc w:val="left"/>
     </w:lvl>
-    <w:lvl w:ilvl="7" w:tplc="717E4C56">
+    <w:lvl w:ilvl="7" w:tplc="8F4855BC">
       <w:numFmt w:val="decimal"/>
       <w:lvlText w:val=""/>
       <w:lvlJc w:val="left"/>
     </w:lvl>
-    <w:lvl w:ilvl="8" w:tplc="EFB482CE">
+    <w:lvl w:ilvl="8" w:tplc="9BC42D7E">
       <w:numFmt w:val="decimal"/>
       <w:lvlText w:val=""/>
       <w:lvlJc w:val="left"/>
     </w:lvl>
   </w:abstractNum>
   <w:abstractNum w:abstractNumId="3" w15:restartNumberingAfterBreak="0">
-    <w:nsid w:val="2DB40F2C"/>
+    <w:nsid w:val="34933937"/>
     <w:multiLevelType w:val="hybridMultilevel"/>
-    <w:tmpl w:val="59768DBE"/>
-    <w:lvl w:ilvl="0" w:tplc="2174E010" w:tentative="1">
+    <w:tmpl w:val="4AD676AC"/>
+    <w:lvl w:ilvl="0" w:tplc="124077C6">
       <w:start w:val="1"/>
       <w:numFmt w:val="decimal"/>
       <w:lvlText w:val="%1."/>
@@ -20084,110 +20202,106 @@
         <w:ind w:left="540" w:hanging="360"/>
       </w:pPr>
     </w:lvl>
-    <w:lvl w:ilvl="1" w:tplc="7E68E3FA">
+    <w:lvl w:ilvl="1" w:tplc="80220836">
       <w:numFmt w:val="decimal"/>
       <w:lvlText w:val=""/>
       <w:lvlJc w:val="left"/>
     </w:lvl>
-    <w:lvl w:ilvl="2" w:tplc="8AD0F9C2">
+    <w:lvl w:ilvl="2" w:tplc="7DAC9C1C">
       <w:numFmt w:val="decimal"/>
       <w:lvlText w:val=""/>
       <w:lvlJc w:val="left"/>
     </w:lvl>
-    <w:lvl w:ilvl="3" w:tplc="1B700F7A">
+    <w:lvl w:ilvl="3" w:tplc="8E968ADE">
       <w:numFmt w:val="decimal"/>
       <w:lvlText w:val=""/>
       <w:lvlJc w:val="left"/>
     </w:lvl>
-    <w:lvl w:ilvl="4" w:tplc="FD28782C">
+    <w:lvl w:ilvl="4" w:tplc="FE1E6A30">
       <w:numFmt w:val="decimal"/>
       <w:lvlText w:val=""/>
       <w:lvlJc w:val="left"/>
     </w:lvl>
-    <w:lvl w:ilvl="5" w:tplc="A0161510">
+    <w:lvl w:ilvl="5" w:tplc="424CBA26">
       <w:numFmt w:val="decimal"/>
       <w:lvlText w:val=""/>
       <w:lvlJc w:val="left"/>
     </w:lvl>
-    <w:lvl w:ilvl="6" w:tplc="624C78BC">
+    <w:lvl w:ilvl="6" w:tplc="EA50AD02">
       <w:numFmt w:val="decimal"/>
       <w:lvlText w:val=""/>
       <w:lvlJc w:val="left"/>
     </w:lvl>
-    <w:lvl w:ilvl="7" w:tplc="54583A4C">
+    <w:lvl w:ilvl="7" w:tplc="98E8ACD6">
       <w:numFmt w:val="decimal"/>
       <w:lvlText w:val=""/>
       <w:lvlJc w:val="left"/>
     </w:lvl>
-    <w:lvl w:ilvl="8" w:tplc="05C6E9F2">
+    <w:lvl w:ilvl="8" w:tplc="129E7E02">
       <w:numFmt w:val="decimal"/>
       <w:lvlText w:val=""/>
       <w:lvlJc w:val="left"/>
     </w:lvl>
   </w:abstractNum>
   <w:abstractNum w:abstractNumId="4" w15:restartNumberingAfterBreak="0">
-    <w:nsid w:val="2E8B4CA9"/>
+    <w:nsid w:val="43E31A9C"/>
     <w:multiLevelType w:val="hybridMultilevel"/>
-    <w:tmpl w:val="818A067A"/>
-    <w:lvl w:ilvl="0" w:tplc="F0906A4C">
+    <w:tmpl w:val="253858A8"/>
+    <w:lvl w:ilvl="0" w:tplc="B56EEB7C">
       <w:start w:val="1"/>
-      <w:numFmt w:val="bullet"/>
-      <w:lvlText w:val="•"/>
+      <w:numFmt w:val="decimal"/>
+      <w:lvlText w:val="%1."/>
       <w:lvlJc w:val="left"/>
       <w:pPr>
-        <w:ind w:left="540" w:hanging="300"/>
+        <w:ind w:left="540" w:hanging="360"/>
       </w:pPr>
     </w:lvl>
-    <w:lvl w:ilvl="1" w:tplc="65BAFB24" w:tentative="1">
-      <w:start w:val="1"/>
-      <w:numFmt w:val="bullet"/>
-      <w:lvlText w:val="◦"/>
-      <w:lvlJc w:val="left"/>
-      <w:pPr>
-        <w:ind w:left="1080" w:hanging="300"/>
-      </w:pPr>
-    </w:lvl>
-    <w:lvl w:ilvl="2" w:tplc="4524F412">
+    <w:lvl w:ilvl="1" w:tplc="9B4C4E68">
       <w:numFmt w:val="decimal"/>
       <w:lvlText w:val=""/>
       <w:lvlJc w:val="left"/>
     </w:lvl>
-    <w:lvl w:ilvl="3" w:tplc="03FA02C8">
+    <w:lvl w:ilvl="2" w:tplc="7708EA4C">
       <w:numFmt w:val="decimal"/>
       <w:lvlText w:val=""/>
       <w:lvlJc w:val="left"/>
     </w:lvl>
-    <w:lvl w:ilvl="4" w:tplc="21FAF420">
+    <w:lvl w:ilvl="3" w:tplc="115E9AB6">
       <w:numFmt w:val="decimal"/>
       <w:lvlText w:val=""/>
       <w:lvlJc w:val="left"/>
     </w:lvl>
-    <w:lvl w:ilvl="5" w:tplc="1666B4C8">
+    <w:lvl w:ilvl="4" w:tplc="CDC6A9B0">
       <w:numFmt w:val="decimal"/>
       <w:lvlText w:val=""/>
       <w:lvlJc w:val="left"/>
     </w:lvl>
-    <w:lvl w:ilvl="6" w:tplc="C980E018">
+    <w:lvl w:ilvl="5" w:tplc="39EC78F6">
       <w:numFmt w:val="decimal"/>
       <w:lvlText w:val=""/>
       <w:lvlJc w:val="left"/>
     </w:lvl>
-    <w:lvl w:ilvl="7" w:tplc="B6D6CFDE">
+    <w:lvl w:ilvl="6" w:tplc="147C3EA8">
       <w:numFmt w:val="decimal"/>
       <w:lvlText w:val=""/>
       <w:lvlJc w:val="left"/>
     </w:lvl>
-    <w:lvl w:ilvl="8" w:tplc="0F8E11B2">
+    <w:lvl w:ilvl="7" w:tplc="299479A0">
+      <w:numFmt w:val="decimal"/>
+      <w:lvlText w:val=""/>
+      <w:lvlJc w:val="left"/>
+    </w:lvl>
+    <w:lvl w:ilvl="8" w:tplc="57860F90">
       <w:numFmt w:val="decimal"/>
       <w:lvlText w:val=""/>
       <w:lvlJc w:val="left"/>
     </w:lvl>
   </w:abstractNum>
   <w:abstractNum w:abstractNumId="5" w15:restartNumberingAfterBreak="0">
-    <w:nsid w:val="2ED845E0"/>
+    <w:nsid w:val="461A0EC4"/>
     <w:multiLevelType w:val="hybridMultilevel"/>
-    <w:tmpl w:val="CEB8E088"/>
-    <w:lvl w:ilvl="0" w:tplc="53C633BA">
+    <w:tmpl w:val="613487A6"/>
+    <w:lvl w:ilvl="0" w:tplc="63AAC87E">
       <w:start w:val="1"/>
       <w:numFmt w:val="decimal"/>
       <w:lvlText w:val="%1."/>
@@ -20196,52 +20310,52 @@
         <w:ind w:left="540" w:hanging="360"/>
       </w:pPr>
     </w:lvl>
-    <w:lvl w:ilvl="1" w:tplc="EB1E9CD6">
+    <w:lvl w:ilvl="1" w:tplc="24C0444E">
       <w:numFmt w:val="decimal"/>
       <w:lvlText w:val=""/>
       <w:lvlJc w:val="left"/>
     </w:lvl>
-    <w:lvl w:ilvl="2" w:tplc="3C026FF4">
+    <w:lvl w:ilvl="2" w:tplc="D4740D68">
       <w:numFmt w:val="decimal"/>
       <w:lvlText w:val=""/>
       <w:lvlJc w:val="left"/>
     </w:lvl>
-    <w:lvl w:ilvl="3" w:tplc="47B0995A">
+    <w:lvl w:ilvl="3" w:tplc="CDD4CE9E">
       <w:numFmt w:val="decimal"/>
       <w:lvlText w:val=""/>
       <w:lvlJc w:val="left"/>
     </w:lvl>
-    <w:lvl w:ilvl="4" w:tplc="A90846EE">
+    <w:lvl w:ilvl="4" w:tplc="F9746CB4">
       <w:numFmt w:val="decimal"/>
       <w:lvlText w:val=""/>
       <w:lvlJc w:val="left"/>
     </w:lvl>
-    <w:lvl w:ilvl="5" w:tplc="6DA0092C">
+    <w:lvl w:ilvl="5" w:tplc="BF500C5C">
       <w:numFmt w:val="decimal"/>
       <w:lvlText w:val=""/>
       <w:lvlJc w:val="left"/>
     </w:lvl>
-    <w:lvl w:ilvl="6" w:tplc="426A57C4">
+    <w:lvl w:ilvl="6" w:tplc="A8402FC6">
       <w:numFmt w:val="decimal"/>
       <w:lvlText w:val=""/>
       <w:lvlJc w:val="left"/>
     </w:lvl>
-    <w:lvl w:ilvl="7" w:tplc="681C8E02">
+    <w:lvl w:ilvl="7" w:tplc="216EDABA">
       <w:numFmt w:val="decimal"/>
       <w:lvlText w:val=""/>
       <w:lvlJc w:val="left"/>
     </w:lvl>
-    <w:lvl w:ilvl="8" w:tplc="766467FA">
+    <w:lvl w:ilvl="8" w:tplc="BE823BCA">
       <w:numFmt w:val="decimal"/>
       <w:lvlText w:val=""/>
       <w:lvlJc w:val="left"/>
     </w:lvl>
   </w:abstractNum>
   <w:abstractNum w:abstractNumId="6" w15:restartNumberingAfterBreak="0">
-    <w:nsid w:val="4959298F"/>
+    <w:nsid w:val="46FB3EF8"/>
     <w:multiLevelType w:val="hybridMultilevel"/>
-    <w:tmpl w:val="F886B5BE"/>
-    <w:lvl w:ilvl="0" w:tplc="EDC08D26">
+    <w:tmpl w:val="05247EBA"/>
+    <w:lvl w:ilvl="0" w:tplc="3F40E8B8" w:tentative="1">
       <w:start w:val="1"/>
       <w:numFmt w:val="decimal"/>
       <w:lvlText w:val="%1."/>
@@ -20250,106 +20364,110 @@
         <w:ind w:left="540" w:hanging="360"/>
       </w:pPr>
     </w:lvl>
-    <w:lvl w:ilvl="1" w:tplc="661A6760">
+    <w:lvl w:ilvl="1" w:tplc="A2926690">
       <w:numFmt w:val="decimal"/>
       <w:lvlText w:val=""/>
       <w:lvlJc w:val="left"/>
     </w:lvl>
-    <w:lvl w:ilvl="2" w:tplc="30963080">
+    <w:lvl w:ilvl="2" w:tplc="3BA80596">
       <w:numFmt w:val="decimal"/>
       <w:lvlText w:val=""/>
       <w:lvlJc w:val="left"/>
     </w:lvl>
-    <w:lvl w:ilvl="3" w:tplc="26D2A3A6">
+    <w:lvl w:ilvl="3" w:tplc="BC08330E">
       <w:numFmt w:val="decimal"/>
       <w:lvlText w:val=""/>
       <w:lvlJc w:val="left"/>
     </w:lvl>
-    <w:lvl w:ilvl="4" w:tplc="B55AAF18">
+    <w:lvl w:ilvl="4" w:tplc="0C742F96">
       <w:numFmt w:val="decimal"/>
       <w:lvlText w:val=""/>
       <w:lvlJc w:val="left"/>
     </w:lvl>
-    <w:lvl w:ilvl="5" w:tplc="E14015BA">
+    <w:lvl w:ilvl="5" w:tplc="D7E0254E">
       <w:numFmt w:val="decimal"/>
       <w:lvlText w:val=""/>
       <w:lvlJc w:val="left"/>
     </w:lvl>
-    <w:lvl w:ilvl="6" w:tplc="CB38CE06">
+    <w:lvl w:ilvl="6" w:tplc="9E72FC78">
       <w:numFmt w:val="decimal"/>
       <w:lvlText w:val=""/>
       <w:lvlJc w:val="left"/>
     </w:lvl>
-    <w:lvl w:ilvl="7" w:tplc="6EC295B0">
+    <w:lvl w:ilvl="7" w:tplc="25AA568E">
       <w:numFmt w:val="decimal"/>
       <w:lvlText w:val=""/>
       <w:lvlJc w:val="left"/>
     </w:lvl>
-    <w:lvl w:ilvl="8" w:tplc="0CF432A6">
+    <w:lvl w:ilvl="8" w:tplc="EA729DB0">
       <w:numFmt w:val="decimal"/>
       <w:lvlText w:val=""/>
       <w:lvlJc w:val="left"/>
     </w:lvl>
   </w:abstractNum>
   <w:abstractNum w:abstractNumId="7" w15:restartNumberingAfterBreak="0">
-    <w:nsid w:val="4BCF78A3"/>
+    <w:nsid w:val="62435D26"/>
     <w:multiLevelType w:val="hybridMultilevel"/>
-    <w:tmpl w:val="C8B41EEA"/>
-    <w:lvl w:ilvl="0" w:tplc="5F98B454">
+    <w:tmpl w:val="9F7E4E04"/>
+    <w:lvl w:ilvl="0" w:tplc="73F62792">
       <w:start w:val="1"/>
-      <w:numFmt w:val="decimal"/>
-      <w:lvlText w:val="%1."/>
+      <w:numFmt w:val="bullet"/>
+      <w:lvlText w:val="•"/>
       <w:lvlJc w:val="left"/>
       <w:pPr>
-        <w:ind w:left="540" w:hanging="360"/>
+        <w:ind w:left="540" w:hanging="300"/>
       </w:pPr>
     </w:lvl>
-    <w:lvl w:ilvl="1" w:tplc="786E9A58">
+    <w:lvl w:ilvl="1" w:tplc="7EB2F79C" w:tentative="1">
+      <w:start w:val="1"/>
+      <w:numFmt w:val="bullet"/>
+      <w:lvlText w:val="◦"/>
+      <w:lvlJc w:val="left"/>
+      <w:pPr>
+        <w:ind w:left="1080" w:hanging="300"/>
+      </w:pPr>
+    </w:lvl>
+    <w:lvl w:ilvl="2" w:tplc="BD2236F8">
       <w:numFmt w:val="decimal"/>
       <w:lvlText w:val=""/>
       <w:lvlJc w:val="left"/>
     </w:lvl>
-    <w:lvl w:ilvl="2" w:tplc="AB2413A6">
+    <w:lvl w:ilvl="3" w:tplc="4F42EF64">
       <w:numFmt w:val="decimal"/>
       <w:lvlText w:val=""/>
       <w:lvlJc w:val="left"/>
     </w:lvl>
-    <w:lvl w:ilvl="3" w:tplc="213C40E4">
+    <w:lvl w:ilvl="4" w:tplc="7B749E6A">
       <w:numFmt w:val="decimal"/>
       <w:lvlText w:val=""/>
       <w:lvlJc w:val="left"/>
     </w:lvl>
-    <w:lvl w:ilvl="4" w:tplc="EAD8EA02">
+    <w:lvl w:ilvl="5" w:tplc="EB34ADCA">
       <w:numFmt w:val="decimal"/>
       <w:lvlText w:val=""/>
       <w:lvlJc w:val="left"/>
     </w:lvl>
-    <w:lvl w:ilvl="5" w:tplc="CF2C65A2">
+    <w:lvl w:ilvl="6" w:tplc="D346D166">
       <w:numFmt w:val="decimal"/>
       <w:lvlText w:val=""/>
       <w:lvlJc w:val="left"/>
     </w:lvl>
-    <w:lvl w:ilvl="6" w:tplc="9022DF3C">
+    <w:lvl w:ilvl="7" w:tplc="E00E17AA">
       <w:numFmt w:val="decimal"/>
       <w:lvlText w:val=""/>
       <w:lvlJc w:val="left"/>
     </w:lvl>
-    <w:lvl w:ilvl="7" w:tplc="92C06CE8">
-      <w:numFmt w:val="decimal"/>
-      <w:lvlText w:val=""/>
-      <w:lvlJc w:val="left"/>
-    </w:lvl>
-    <w:lvl w:ilvl="8" w:tplc="8E0874E8">
+    <w:lvl w:ilvl="8" w:tplc="3A94BD2C">
       <w:numFmt w:val="decimal"/>
       <w:lvlText w:val=""/>
       <w:lvlJc w:val="left"/>
     </w:lvl>
   </w:abstractNum>
   <w:abstractNum w:abstractNumId="8" w15:restartNumberingAfterBreak="0">
-    <w:nsid w:val="613625D5"/>
+    <w:nsid w:val="77B05CFC"/>
     <w:multiLevelType w:val="hybridMultilevel"/>
-    <w:tmpl w:val="385C9F1E"/>
-    <w:lvl w:ilvl="0" w:tplc="F1D87F9A">
+    <w:tmpl w:val="FDFA0A7C"/>
+    <w:lvl w:ilvl="0" w:tplc="B560948C">
       <w:start w:val="1"/>
       <w:numFmt w:val="decimal"/>
       <w:lvlText w:val="%1."/>
@@ -20358,91 +20476,91 @@
         <w:ind w:left="540" w:hanging="360"/>
       </w:pPr>
     </w:lvl>
-    <w:lvl w:ilvl="1" w:tplc="D67E3896">
+    <w:lvl w:ilvl="1" w:tplc="3F445F3E">
       <w:numFmt w:val="decimal"/>
       <w:lvlText w:val=""/>
       <w:lvlJc w:val="left"/>
     </w:lvl>
-    <w:lvl w:ilvl="2" w:tplc="3930782A">
+    <w:lvl w:ilvl="2" w:tplc="2550D21A">
       <w:numFmt w:val="decimal"/>
       <w:lvlText w:val=""/>
       <w:lvlJc w:val="left"/>
     </w:lvl>
-    <w:lvl w:ilvl="3" w:tplc="81C01F28">
+    <w:lvl w:ilvl="3" w:tplc="B8FAF8A4">
       <w:numFmt w:val="decimal"/>
       <w:lvlText w:val=""/>
       <w:lvlJc w:val="left"/>
     </w:lvl>
-    <w:lvl w:ilvl="4" w:tplc="A06E38B8">
+    <w:lvl w:ilvl="4" w:tplc="70088006">
       <w:numFmt w:val="decimal"/>
       <w:lvlText w:val=""/>
       <w:lvlJc w:val="left"/>
     </w:lvl>
-    <w:lvl w:ilvl="5" w:tplc="79A05834">
+    <w:lvl w:ilvl="5" w:tplc="0A604766">
       <w:numFmt w:val="decimal"/>
       <w:lvlText w:val=""/>
       <w:lvlJc w:val="left"/>
     </w:lvl>
-    <w:lvl w:ilvl="6" w:tplc="1AFE0D08">
+    <w:lvl w:ilvl="6" w:tplc="A8B23014">
       <w:numFmt w:val="decimal"/>
       <w:lvlText w:val=""/>
       <w:lvlJc w:val="left"/>
     </w:lvl>
-    <w:lvl w:ilvl="7" w:tplc="55EEF612">
+    <w:lvl w:ilvl="7" w:tplc="FE4C32B4">
       <w:numFmt w:val="decimal"/>
       <w:lvlText w:val=""/>
       <w:lvlJc w:val="left"/>
     </w:lvl>
-    <w:lvl w:ilvl="8" w:tplc="CA56D08C">
+    <w:lvl w:ilvl="8" w:tplc="9BF0D238">
       <w:numFmt w:val="decimal"/>
       <w:lvlText w:val=""/>
       <w:lvlJc w:val="left"/>
     </w:lvl>
   </w:abstractNum>
-  <w:num w:numId="1" w16cid:durableId="335421792">
+  <w:num w:numId="1" w16cid:durableId="903755784">
+    <w:abstractNumId w:val="0"/>
+    <w:lvlOverride w:ilvl="0">
+      <w:startOverride w:val="1"/>
+    </w:lvlOverride>
+  </w:num>
+  <w:num w:numId="2" w16cid:durableId="2020695550">
+    <w:abstractNumId w:val="7"/>
+    <w:lvlOverride w:ilvl="0">
+      <w:startOverride w:val="1"/>
+    </w:lvlOverride>
+  </w:num>
+  <w:num w:numId="3" w16cid:durableId="514417983">
+    <w:abstractNumId w:val="8"/>
+    <w:lvlOverride w:ilvl="0">
+      <w:startOverride w:val="1"/>
+    </w:lvlOverride>
+  </w:num>
+  <w:num w:numId="4" w16cid:durableId="2124379641">
     <w:abstractNumId w:val="1"/>
     <w:lvlOverride w:ilvl="0">
       <w:startOverride w:val="1"/>
     </w:lvlOverride>
   </w:num>
-  <w:num w:numId="2" w16cid:durableId="1060902137">
+  <w:num w:numId="5" w16cid:durableId="375469760">
     <w:abstractNumId w:val="4"/>
     <w:lvlOverride w:ilvl="0">
       <w:startOverride w:val="1"/>
     </w:lvlOverride>
   </w:num>
-  <w:num w:numId="3" w16cid:durableId="422340370">
-    <w:abstractNumId w:val="0"/>
+  <w:num w:numId="6" w16cid:durableId="1073426572">
+    <w:abstractNumId w:val="5"/>
     <w:lvlOverride w:ilvl="0">
       <w:startOverride w:val="1"/>
     </w:lvlOverride>
   </w:num>
-  <w:num w:numId="4" w16cid:durableId="967004402">
-    <w:abstractNumId w:val="7"/>
-    <w:lvlOverride w:ilvl="0">
-      <w:startOverride w:val="1"/>
-    </w:lvlOverride>
-  </w:num>
-  <w:num w:numId="5" w16cid:durableId="1496845226">
+  <w:num w:numId="7" w16cid:durableId="686448542">
     <w:abstractNumId w:val="2"/>
     <w:lvlOverride w:ilvl="0">
       <w:startOverride w:val="1"/>
     </w:lvlOverride>
   </w:num>
-  <w:num w:numId="6" w16cid:durableId="456875419">
-    <w:abstractNumId w:val="6"/>
-    <w:lvlOverride w:ilvl="0">
-      <w:startOverride w:val="1"/>
-    </w:lvlOverride>
-  </w:num>
-  <w:num w:numId="7" w16cid:durableId="544099545">
-    <w:abstractNumId w:val="8"/>
-    <w:lvlOverride w:ilvl="0">
-      <w:startOverride w:val="1"/>
-    </w:lvlOverride>
-  </w:num>
-  <w:num w:numId="8" w16cid:durableId="2145001365">
-    <w:abstractNumId w:val="5"/>
+  <w:num w:numId="8" w16cid:durableId="426534860">
+    <w:abstractNumId w:val="3"/>
     <w:lvlOverride w:ilvl="0">
       <w:startOverride w:val="1"/>
     </w:lvlOverride>
@@ -21086,7 +21204,7 @@
     <w:autoRedefine/>
     <w:uiPriority w:val="39"/>
     <w:unhideWhenUsed/>
-    <w:rsid w:val="0019109D"/>
+    <w:rsid w:val="00DE1C7A"/>
     <w:pPr>
       <w:spacing w:after="100"/>
     </w:pPr>
@@ -21098,7 +21216,7 @@
     <w:autoRedefine/>
     <w:uiPriority w:val="39"/>
     <w:unhideWhenUsed/>
-    <w:rsid w:val="0019109D"/>
+    <w:rsid w:val="00DE1C7A"/>
     <w:pPr>
       <w:spacing w:after="100"/>
       <w:ind w:left="220"/>

</xml_diff>